<commit_message>
Adding the Spring cloud questions
</commit_message>
<xml_diff>
--- a/Spring-Cloud-Tutorials/Spring-Cloud-Fundamentals/SpringCloudGitFileLocation/Coupon-Product-Spring-Cloud-Flow.docx
+++ b/Spring-Cloud-Tutorials/Spring-Cloud-Fundamentals/SpringCloudGitFileLocation/Coupon-Product-Spring-Cloud-Flow.docx
@@ -77,9 +77,9 @@
                 <w:szCs w:val="20"/>
               </w:rPr>
               <w:drawing>
-                <wp:inline distT="0" distB="0" distL="0" distR="0" wp14:anchorId="193FE38B" wp14:editId="43090E55">
-                  <wp:extent cx="7200900" cy="4282440"/>
-                  <wp:effectExtent l="0" t="0" r="0" b="3810"/>
+                <wp:inline distT="0" distB="0" distL="0" distR="0" wp14:anchorId="193FE38B" wp14:editId="0CAAB975">
+                  <wp:extent cx="6947647" cy="4282440"/>
+                  <wp:effectExtent l="0" t="0" r="5715" b="3810"/>
                   <wp:docPr id="1533367812" name="Picture 1"/>
                   <wp:cNvGraphicFramePr>
                     <a:graphicFrameLocks xmlns:a="http://schemas.openxmlformats.org/drawingml/2006/main" noChangeAspect="1"/>
@@ -100,7 +100,7 @@
                         <pic:spPr>
                           <a:xfrm>
                             <a:off x="0" y="0"/>
-                            <a:ext cx="7200900" cy="4282440"/>
+                            <a:ext cx="6948861" cy="4283188"/>
                           </a:xfrm>
                           <a:prstGeom prst="rect">
                             <a:avLst/>
@@ -7376,7 +7376,7 @@
           <w:szCs w:val="20"/>
         </w:rPr>
         <w:drawing>
-          <wp:inline distT="0" distB="0" distL="0" distR="0" wp14:anchorId="72047844" wp14:editId="18414C9D">
+          <wp:inline distT="0" distB="0" distL="0" distR="0" wp14:anchorId="72047844" wp14:editId="4EB44C9F">
             <wp:extent cx="4617720" cy="2598420"/>
             <wp:effectExtent l="0" t="0" r="0" b="0"/>
             <wp:docPr id="147502854" name="Picture 12"/>
@@ -8113,7 +8113,7 @@
         </w:rPr>
         <w:lastRenderedPageBreak/>
         <w:drawing>
-          <wp:inline distT="0" distB="0" distL="0" distR="0" wp14:anchorId="3086C742" wp14:editId="67829955">
+          <wp:inline distT="0" distB="0" distL="0" distR="0" wp14:anchorId="3086C742" wp14:editId="194A33DC">
             <wp:extent cx="5631180" cy="3162300"/>
             <wp:effectExtent l="0" t="0" r="7620" b="0"/>
             <wp:docPr id="1501862103" name="Picture 11"/>
@@ -8973,7 +8973,7 @@
         </w:rPr>
         <w:lastRenderedPageBreak/>
         <w:drawing>
-          <wp:inline distT="0" distB="0" distL="0" distR="0" wp14:anchorId="3D9700E0" wp14:editId="4085C926">
+          <wp:inline distT="0" distB="0" distL="0" distR="0" wp14:anchorId="3D9700E0" wp14:editId="3D23964F">
             <wp:extent cx="7200900" cy="4050665"/>
             <wp:effectExtent l="0" t="0" r="0" b="6985"/>
             <wp:docPr id="979715023" name="Picture 10"/>
@@ -9547,7 +9547,7 @@
         </w:rPr>
         <w:lastRenderedPageBreak/>
         <w:drawing>
-          <wp:inline distT="0" distB="0" distL="0" distR="0" wp14:anchorId="6509594E" wp14:editId="79760AB5">
+          <wp:inline distT="0" distB="0" distL="0" distR="0" wp14:anchorId="6509594E" wp14:editId="076B5EE1">
             <wp:extent cx="6096000" cy="3429000"/>
             <wp:effectExtent l="0" t="0" r="0" b="0"/>
             <wp:docPr id="384072070" name="Picture 9"/>
@@ -9969,7 +9969,7 @@
           <w:szCs w:val="20"/>
         </w:rPr>
         <w:drawing>
-          <wp:inline distT="0" distB="0" distL="0" distR="0" wp14:anchorId="32B3ED90" wp14:editId="68254933">
+          <wp:inline distT="0" distB="0" distL="0" distR="0" wp14:anchorId="32B3ED90" wp14:editId="7736ABD7">
             <wp:extent cx="5364480" cy="3017520"/>
             <wp:effectExtent l="0" t="0" r="7620" b="0"/>
             <wp:docPr id="792952572" name="Picture 8"/>
@@ -10976,7 +10976,7 @@
           <w:szCs w:val="20"/>
         </w:rPr>
         <w:drawing>
-          <wp:inline distT="0" distB="0" distL="0" distR="0" wp14:anchorId="3BAD7A31" wp14:editId="034AD04A">
+          <wp:inline distT="0" distB="0" distL="0" distR="0" wp14:anchorId="3BAD7A31" wp14:editId="0C997BFF">
             <wp:extent cx="5036820" cy="2842260"/>
             <wp:effectExtent l="0" t="0" r="0" b="0"/>
             <wp:docPr id="276057737" name="Picture 7"/>

</xml_diff>

<commit_message>
Creating Q and A
</commit_message>
<xml_diff>
--- a/Spring-Cloud-Tutorials/Spring-Cloud-Fundamentals/SpringCloudGitFileLocation/Coupon-Product-Spring-Cloud-Flow.docx
+++ b/Spring-Cloud-Tutorials/Spring-Cloud-Fundamentals/SpringCloudGitFileLocation/Coupon-Product-Spring-Cloud-Flow.docx
@@ -7311,4703 +7311,6 @@
           <w:szCs w:val="20"/>
         </w:rPr>
       </w:pPr>
-    </w:p>
-    <w:p>
-      <w:pPr>
-        <w:tabs>
-          <w:tab w:val="left" w:pos="1172"/>
-        </w:tabs>
-        <w:spacing w:after="0"/>
-        <w:rPr>
-          <w:b/>
-          <w:bCs/>
-          <w:sz w:val="20"/>
-          <w:szCs w:val="20"/>
-        </w:rPr>
-      </w:pPr>
-    </w:p>
-    <w:p>
-      <w:pPr>
-        <w:tabs>
-          <w:tab w:val="left" w:pos="1172"/>
-        </w:tabs>
-        <w:spacing w:after="0"/>
-        <w:rPr>
-          <w:sz w:val="20"/>
-          <w:szCs w:val="20"/>
-        </w:rPr>
-      </w:pPr>
-      <w:r>
-        <w:rPr>
-          <w:sz w:val="20"/>
-          <w:szCs w:val="20"/>
-        </w:rPr>
-        <w:lastRenderedPageBreak/>
-        <w:t>1) What is Spring Cloud?</w:t>
-      </w:r>
-    </w:p>
-    <w:p>
-      <w:pPr>
-        <w:tabs>
-          <w:tab w:val="left" w:pos="1172"/>
-        </w:tabs>
-        <w:spacing w:after="0"/>
-        <w:rPr>
-          <w:sz w:val="20"/>
-          <w:szCs w:val="20"/>
-        </w:rPr>
-      </w:pPr>
-    </w:p>
-    <w:p>
-      <w:pPr>
-        <w:tabs>
-          <w:tab w:val="left" w:pos="1172"/>
-        </w:tabs>
-        <w:spacing w:after="0"/>
-        <w:rPr>
-          <w:sz w:val="20"/>
-          <w:szCs w:val="20"/>
-        </w:rPr>
-      </w:pPr>
-      <w:r>
-        <w:rPr>
-          <w:noProof/>
-          <w:sz w:val="20"/>
-          <w:szCs w:val="20"/>
-        </w:rPr>
-        <w:drawing>
-          <wp:inline distT="0" distB="0" distL="0" distR="0" wp14:anchorId="72047844" wp14:editId="4EB44C9F">
-            <wp:extent cx="4617720" cy="2598420"/>
-            <wp:effectExtent l="0" t="0" r="0" b="0"/>
-            <wp:docPr id="147502854" name="Picture 12"/>
-            <wp:cNvGraphicFramePr>
-              <a:graphicFrameLocks xmlns:a="http://schemas.openxmlformats.org/drawingml/2006/main" noChangeAspect="1"/>
-            </wp:cNvGraphicFramePr>
-            <a:graphic xmlns:a="http://schemas.openxmlformats.org/drawingml/2006/main">
-              <a:graphicData uri="http://schemas.openxmlformats.org/drawingml/2006/picture">
-                <pic:pic xmlns:pic="http://schemas.openxmlformats.org/drawingml/2006/picture">
-                  <pic:nvPicPr>
-                    <pic:cNvPr id="0" name="Picture 31"/>
-                    <pic:cNvPicPr>
-                      <a:picLocks noChangeAspect="1" noChangeArrowheads="1"/>
-                    </pic:cNvPicPr>
-                  </pic:nvPicPr>
-                  <pic:blipFill>
-                    <a:blip r:embed="rId22" cstate="print">
-                      <a:extLst>
-                        <a:ext uri="{28A0092B-C50C-407E-A947-70E740481C1C}">
-                          <a14:useLocalDpi xmlns:a14="http://schemas.microsoft.com/office/drawing/2010/main" val="0"/>
-                        </a:ext>
-                      </a:extLst>
-                    </a:blip>
-                    <a:srcRect/>
-                    <a:stretch>
-                      <a:fillRect/>
-                    </a:stretch>
-                  </pic:blipFill>
-                  <pic:spPr bwMode="auto">
-                    <a:xfrm>
-                      <a:off x="0" y="0"/>
-                      <a:ext cx="4617720" cy="2598420"/>
-                    </a:xfrm>
-                    <a:prstGeom prst="rect">
-                      <a:avLst/>
-                    </a:prstGeom>
-                    <a:noFill/>
-                    <a:ln>
-                      <a:noFill/>
-                    </a:ln>
-                  </pic:spPr>
-                </pic:pic>
-              </a:graphicData>
-            </a:graphic>
-          </wp:inline>
-        </w:drawing>
-      </w:r>
-    </w:p>
-    <w:p>
-      <w:pPr>
-        <w:tabs>
-          <w:tab w:val="left" w:pos="1172"/>
-        </w:tabs>
-        <w:spacing w:after="0"/>
-        <w:rPr>
-          <w:sz w:val="20"/>
-          <w:szCs w:val="20"/>
-        </w:rPr>
-      </w:pPr>
-    </w:p>
-    <w:p>
-      <w:pPr>
-        <w:tabs>
-          <w:tab w:val="left" w:pos="1172"/>
-        </w:tabs>
-        <w:spacing w:after="0"/>
-        <w:rPr>
-          <w:sz w:val="20"/>
-          <w:szCs w:val="20"/>
-        </w:rPr>
-      </w:pPr>
-      <w:r>
-        <w:rPr>
-          <w:sz w:val="20"/>
-          <w:szCs w:val="20"/>
-        </w:rPr>
-        <w:t xml:space="preserve">When we implement microservices using the modules provided by Spring </w:t>
-      </w:r>
-      <w:proofErr w:type="gramStart"/>
-      <w:r>
-        <w:rPr>
-          <w:sz w:val="20"/>
-          <w:szCs w:val="20"/>
-        </w:rPr>
-        <w:t>Boot ,</w:t>
-      </w:r>
-      <w:proofErr w:type="gramEnd"/>
-      <w:r>
-        <w:rPr>
-          <w:sz w:val="20"/>
-          <w:szCs w:val="20"/>
-        </w:rPr>
-        <w:t xml:space="preserve"> there will be several non-functional requirements for these microservices as below -</w:t>
-      </w:r>
-    </w:p>
-    <w:p>
-      <w:pPr>
-        <w:tabs>
-          <w:tab w:val="left" w:pos="1172"/>
-        </w:tabs>
-        <w:spacing w:after="0"/>
-        <w:rPr>
-          <w:sz w:val="20"/>
-          <w:szCs w:val="20"/>
-        </w:rPr>
-      </w:pPr>
-      <w:r>
-        <w:rPr>
-          <w:sz w:val="20"/>
-          <w:szCs w:val="20"/>
-        </w:rPr>
-        <w:t>Service Registration and Discovery - Each microservice will have to register itself with a centralized server so that the other microservices will be able to discover that particular micro service and communicate with it dynamically. Without that each microservice will be tightly coupled to another microservice it is using.</w:t>
-      </w:r>
-    </w:p>
-    <w:p>
-      <w:pPr>
-        <w:tabs>
-          <w:tab w:val="left" w:pos="1172"/>
-        </w:tabs>
-        <w:spacing w:after="0"/>
-        <w:rPr>
-          <w:sz w:val="20"/>
-          <w:szCs w:val="20"/>
-        </w:rPr>
-      </w:pPr>
-      <w:r>
-        <w:rPr>
-          <w:sz w:val="20"/>
-          <w:szCs w:val="20"/>
-        </w:rPr>
-        <w:t>Load balancing - As the load to our microservices increases, there should be multiple instances of the same microservice running on different servers and the load should be balanced/distributed.</w:t>
-      </w:r>
-    </w:p>
-    <w:p>
-      <w:pPr>
-        <w:tabs>
-          <w:tab w:val="left" w:pos="1172"/>
-        </w:tabs>
-        <w:spacing w:after="0"/>
-        <w:rPr>
-          <w:sz w:val="20"/>
-          <w:szCs w:val="20"/>
-        </w:rPr>
-      </w:pPr>
-      <w:r>
-        <w:rPr>
-          <w:sz w:val="20"/>
-          <w:szCs w:val="20"/>
-        </w:rPr>
-        <w:t xml:space="preserve">Fault Tolerant - If something goes wrong in one of these microservices then entire systems should not come </w:t>
-      </w:r>
-      <w:proofErr w:type="spellStart"/>
-      <w:proofErr w:type="gramStart"/>
-      <w:r>
-        <w:rPr>
-          <w:sz w:val="20"/>
-          <w:szCs w:val="20"/>
-        </w:rPr>
-        <w:t>down.They</w:t>
-      </w:r>
-      <w:proofErr w:type="spellEnd"/>
-      <w:proofErr w:type="gramEnd"/>
-      <w:r>
-        <w:rPr>
-          <w:sz w:val="20"/>
-          <w:szCs w:val="20"/>
-        </w:rPr>
-        <w:t xml:space="preserve"> should be fault tolerant and handle the faults gracefully.</w:t>
-      </w:r>
-    </w:p>
-    <w:p>
-      <w:pPr>
-        <w:tabs>
-          <w:tab w:val="left" w:pos="1172"/>
-        </w:tabs>
-        <w:spacing w:after="0"/>
-        <w:rPr>
-          <w:sz w:val="20"/>
-          <w:szCs w:val="20"/>
-        </w:rPr>
-      </w:pPr>
-      <w:r>
-        <w:rPr>
-          <w:sz w:val="20"/>
-          <w:szCs w:val="20"/>
-        </w:rPr>
-        <w:t>Easy integration - They should be able to communicate with each other easily through restful client API.</w:t>
-      </w:r>
-    </w:p>
-    <w:p>
-      <w:pPr>
-        <w:tabs>
-          <w:tab w:val="left" w:pos="1172"/>
-        </w:tabs>
-        <w:spacing w:after="0"/>
-        <w:rPr>
-          <w:sz w:val="20"/>
-          <w:szCs w:val="20"/>
-        </w:rPr>
-      </w:pPr>
-      <w:r>
-        <w:rPr>
-          <w:sz w:val="20"/>
-          <w:szCs w:val="20"/>
-        </w:rPr>
-        <w:t xml:space="preserve">Cross cutting concerns - Are common requirements across microservices like </w:t>
-      </w:r>
-      <w:proofErr w:type="gramStart"/>
-      <w:r>
-        <w:rPr>
-          <w:sz w:val="20"/>
-          <w:szCs w:val="20"/>
-        </w:rPr>
-        <w:t>security ,</w:t>
-      </w:r>
-      <w:proofErr w:type="gramEnd"/>
-      <w:r>
-        <w:rPr>
-          <w:sz w:val="20"/>
-          <w:szCs w:val="20"/>
-        </w:rPr>
-        <w:t xml:space="preserve"> authentication, </w:t>
-      </w:r>
-      <w:proofErr w:type="gramStart"/>
-      <w:r>
-        <w:rPr>
-          <w:sz w:val="20"/>
-          <w:szCs w:val="20"/>
-        </w:rPr>
-        <w:t>authorization ,</w:t>
-      </w:r>
-      <w:proofErr w:type="gramEnd"/>
-      <w:r>
-        <w:rPr>
-          <w:sz w:val="20"/>
-          <w:szCs w:val="20"/>
-        </w:rPr>
-        <w:t xml:space="preserve"> logging </w:t>
-      </w:r>
-      <w:proofErr w:type="gramStart"/>
-      <w:r>
-        <w:rPr>
-          <w:sz w:val="20"/>
-          <w:szCs w:val="20"/>
-        </w:rPr>
-        <w:t>etc .</w:t>
-      </w:r>
-      <w:proofErr w:type="gramEnd"/>
-      <w:r>
-        <w:rPr>
-          <w:sz w:val="20"/>
-          <w:szCs w:val="20"/>
-        </w:rPr>
-        <w:t xml:space="preserve"> Instead of repeating those </w:t>
-      </w:r>
-      <w:proofErr w:type="gramStart"/>
-      <w:r>
-        <w:rPr>
-          <w:sz w:val="20"/>
-          <w:szCs w:val="20"/>
-        </w:rPr>
-        <w:t>cross cutting</w:t>
-      </w:r>
-      <w:proofErr w:type="gramEnd"/>
-      <w:r>
-        <w:rPr>
-          <w:sz w:val="20"/>
-          <w:szCs w:val="20"/>
-        </w:rPr>
-        <w:t xml:space="preserve"> concerns across these microservices we should have one place where we can address them.</w:t>
-      </w:r>
-    </w:p>
-    <w:p>
-      <w:pPr>
-        <w:tabs>
-          <w:tab w:val="left" w:pos="1172"/>
-        </w:tabs>
-        <w:spacing w:after="0"/>
-        <w:rPr>
-          <w:sz w:val="20"/>
-          <w:szCs w:val="20"/>
-        </w:rPr>
-      </w:pPr>
-      <w:r>
-        <w:rPr>
-          <w:sz w:val="20"/>
-          <w:szCs w:val="20"/>
-        </w:rPr>
-        <w:t xml:space="preserve">Distributed Tracing - As the requests go from one microservice to </w:t>
-      </w:r>
-      <w:proofErr w:type="gramStart"/>
-      <w:r>
-        <w:rPr>
-          <w:sz w:val="20"/>
-          <w:szCs w:val="20"/>
-        </w:rPr>
-        <w:t>another ,</w:t>
-      </w:r>
-      <w:proofErr w:type="gramEnd"/>
-      <w:r>
-        <w:rPr>
-          <w:sz w:val="20"/>
-          <w:szCs w:val="20"/>
-        </w:rPr>
-        <w:t xml:space="preserve"> we should be able to trace how the requests are going and how the responses are coming </w:t>
-      </w:r>
-      <w:proofErr w:type="spellStart"/>
-      <w:proofErr w:type="gramStart"/>
-      <w:r>
-        <w:rPr>
-          <w:sz w:val="20"/>
-          <w:szCs w:val="20"/>
-        </w:rPr>
-        <w:t>back.When</w:t>
-      </w:r>
-      <w:proofErr w:type="spellEnd"/>
-      <w:proofErr w:type="gramEnd"/>
-      <w:r>
-        <w:rPr>
-          <w:sz w:val="20"/>
-          <w:szCs w:val="20"/>
-        </w:rPr>
-        <w:t xml:space="preserve"> something goes </w:t>
-      </w:r>
-      <w:proofErr w:type="gramStart"/>
-      <w:r>
-        <w:rPr>
-          <w:sz w:val="20"/>
-          <w:szCs w:val="20"/>
-        </w:rPr>
-        <w:t>wrong</w:t>
-      </w:r>
-      <w:proofErr w:type="gramEnd"/>
-      <w:r>
-        <w:rPr>
-          <w:sz w:val="20"/>
-          <w:szCs w:val="20"/>
-        </w:rPr>
-        <w:t xml:space="preserve"> we can exactly pinpoint where it went wrong using distributed </w:t>
-      </w:r>
-      <w:proofErr w:type="gramStart"/>
-      <w:r>
-        <w:rPr>
-          <w:sz w:val="20"/>
-          <w:szCs w:val="20"/>
-        </w:rPr>
-        <w:t>tracing .</w:t>
-      </w:r>
-      <w:proofErr w:type="gramEnd"/>
-    </w:p>
-    <w:p>
-      <w:pPr>
-        <w:tabs>
-          <w:tab w:val="left" w:pos="1172"/>
-        </w:tabs>
-        <w:spacing w:after="0"/>
-        <w:rPr>
-          <w:sz w:val="20"/>
-          <w:szCs w:val="20"/>
-        </w:rPr>
-      </w:pPr>
-      <w:r>
-        <w:rPr>
-          <w:sz w:val="20"/>
-          <w:szCs w:val="20"/>
-        </w:rPr>
-        <w:t xml:space="preserve">All these are not available in Spring </w:t>
-      </w:r>
-      <w:proofErr w:type="spellStart"/>
-      <w:r>
-        <w:rPr>
-          <w:sz w:val="20"/>
-          <w:szCs w:val="20"/>
-        </w:rPr>
-        <w:t>Boot.That</w:t>
-      </w:r>
-      <w:proofErr w:type="spellEnd"/>
-      <w:r>
-        <w:rPr>
-          <w:sz w:val="20"/>
-          <w:szCs w:val="20"/>
-        </w:rPr>
-        <w:t xml:space="preserve"> is where the Spring Cloud comes in. Spring cloud is a collection of </w:t>
-      </w:r>
-      <w:proofErr w:type="gramStart"/>
-      <w:r>
-        <w:rPr>
-          <w:sz w:val="20"/>
-          <w:szCs w:val="20"/>
-        </w:rPr>
-        <w:t>open source</w:t>
-      </w:r>
-      <w:proofErr w:type="gramEnd"/>
-      <w:r>
-        <w:rPr>
-          <w:sz w:val="20"/>
-          <w:szCs w:val="20"/>
-        </w:rPr>
-        <w:t xml:space="preserve"> components that help us implement all these </w:t>
-      </w:r>
-      <w:proofErr w:type="spellStart"/>
-      <w:proofErr w:type="gramStart"/>
-      <w:r>
-        <w:rPr>
-          <w:sz w:val="20"/>
-          <w:szCs w:val="20"/>
-        </w:rPr>
-        <w:t>non functional</w:t>
-      </w:r>
-      <w:proofErr w:type="spellEnd"/>
-      <w:proofErr w:type="gramEnd"/>
-      <w:r>
-        <w:rPr>
-          <w:sz w:val="20"/>
-          <w:szCs w:val="20"/>
-        </w:rPr>
-        <w:t xml:space="preserve"> requirements and more.</w:t>
-      </w:r>
-    </w:p>
-    <w:p>
-      <w:pPr>
-        <w:tabs>
-          <w:tab w:val="left" w:pos="1172"/>
-        </w:tabs>
-        <w:spacing w:after="0"/>
-        <w:rPr>
-          <w:sz w:val="20"/>
-          <w:szCs w:val="20"/>
-        </w:rPr>
-      </w:pPr>
-      <w:r>
-        <w:rPr>
-          <w:sz w:val="20"/>
-          <w:szCs w:val="20"/>
-        </w:rPr>
-        <w:t>Service registration and discovery is provided by Eureka</w:t>
-      </w:r>
-    </w:p>
-    <w:p>
-      <w:pPr>
-        <w:tabs>
-          <w:tab w:val="left" w:pos="1172"/>
-        </w:tabs>
-        <w:spacing w:after="0"/>
-        <w:rPr>
-          <w:sz w:val="20"/>
-          <w:szCs w:val="20"/>
-        </w:rPr>
-      </w:pPr>
-      <w:r>
-        <w:rPr>
-          <w:sz w:val="20"/>
-          <w:szCs w:val="20"/>
-        </w:rPr>
-        <w:t>Load Balancing is provided by Ribbon</w:t>
-      </w:r>
-    </w:p>
-    <w:p>
-      <w:pPr>
-        <w:tabs>
-          <w:tab w:val="left" w:pos="1172"/>
-        </w:tabs>
-        <w:spacing w:after="0"/>
-        <w:rPr>
-          <w:sz w:val="20"/>
-          <w:szCs w:val="20"/>
-        </w:rPr>
-      </w:pPr>
-      <w:r>
-        <w:rPr>
-          <w:sz w:val="20"/>
-          <w:szCs w:val="20"/>
-        </w:rPr>
-        <w:t>Fault tolerance is provided Hystrix</w:t>
-      </w:r>
-    </w:p>
-    <w:p>
-      <w:pPr>
-        <w:tabs>
-          <w:tab w:val="left" w:pos="1172"/>
-        </w:tabs>
-        <w:spacing w:after="0"/>
-        <w:rPr>
-          <w:sz w:val="20"/>
-          <w:szCs w:val="20"/>
-        </w:rPr>
-      </w:pPr>
-      <w:r>
-        <w:rPr>
-          <w:sz w:val="20"/>
-          <w:szCs w:val="20"/>
-        </w:rPr>
-        <w:t>Feign Client which will help us create restful clients in a super easy way</w:t>
-      </w:r>
-    </w:p>
-    <w:p>
-      <w:pPr>
-        <w:tabs>
-          <w:tab w:val="left" w:pos="1172"/>
-        </w:tabs>
-        <w:spacing w:after="0"/>
-        <w:rPr>
-          <w:sz w:val="20"/>
-          <w:szCs w:val="20"/>
-        </w:rPr>
-      </w:pPr>
-      <w:r>
-        <w:rPr>
-          <w:sz w:val="20"/>
-          <w:szCs w:val="20"/>
-        </w:rPr>
-        <w:t xml:space="preserve">The </w:t>
-      </w:r>
-      <w:proofErr w:type="gramStart"/>
-      <w:r>
-        <w:rPr>
-          <w:sz w:val="20"/>
-          <w:szCs w:val="20"/>
-        </w:rPr>
-        <w:t>cross cutting</w:t>
-      </w:r>
-      <w:proofErr w:type="gramEnd"/>
-      <w:r>
-        <w:rPr>
-          <w:sz w:val="20"/>
-          <w:szCs w:val="20"/>
-        </w:rPr>
-        <w:t xml:space="preserve"> concerns are configured using a </w:t>
-      </w:r>
-      <w:proofErr w:type="spellStart"/>
-      <w:r>
-        <w:rPr>
-          <w:sz w:val="20"/>
-          <w:szCs w:val="20"/>
-        </w:rPr>
-        <w:t>Zuul</w:t>
-      </w:r>
-      <w:proofErr w:type="spellEnd"/>
-      <w:r>
-        <w:rPr>
-          <w:sz w:val="20"/>
-          <w:szCs w:val="20"/>
-        </w:rPr>
-        <w:t xml:space="preserve"> proxy </w:t>
-      </w:r>
-      <w:proofErr w:type="gramStart"/>
-      <w:r>
-        <w:rPr>
-          <w:sz w:val="20"/>
-          <w:szCs w:val="20"/>
-        </w:rPr>
-        <w:t>gateway .Whatever</w:t>
-      </w:r>
-      <w:proofErr w:type="gramEnd"/>
-      <w:r>
-        <w:rPr>
-          <w:sz w:val="20"/>
-          <w:szCs w:val="20"/>
-        </w:rPr>
-        <w:t xml:space="preserve"> is common across our microservices we can implement them in a single place in a single </w:t>
-      </w:r>
-      <w:proofErr w:type="spellStart"/>
-      <w:r>
-        <w:rPr>
-          <w:sz w:val="20"/>
-          <w:szCs w:val="20"/>
-        </w:rPr>
-        <w:t>Zuul</w:t>
-      </w:r>
-      <w:proofErr w:type="spellEnd"/>
-      <w:r>
-        <w:rPr>
-          <w:sz w:val="20"/>
-          <w:szCs w:val="20"/>
-        </w:rPr>
-        <w:t xml:space="preserve"> Server.</w:t>
-      </w:r>
-    </w:p>
-    <w:p>
-      <w:pPr>
-        <w:tabs>
-          <w:tab w:val="left" w:pos="1172"/>
-        </w:tabs>
-        <w:spacing w:after="0"/>
-        <w:rPr>
-          <w:sz w:val="20"/>
-          <w:szCs w:val="20"/>
-        </w:rPr>
-      </w:pPr>
-      <w:r>
-        <w:rPr>
-          <w:sz w:val="20"/>
-          <w:szCs w:val="20"/>
-        </w:rPr>
-        <w:t>Sleuth allows us to do distributed tracing as the requests go from one micro service to another.</w:t>
-      </w:r>
-    </w:p>
-    <w:p>
-      <w:pPr>
-        <w:tabs>
-          <w:tab w:val="left" w:pos="1172"/>
-        </w:tabs>
-        <w:spacing w:after="0"/>
-        <w:rPr>
-          <w:sz w:val="20"/>
-          <w:szCs w:val="20"/>
-        </w:rPr>
-      </w:pPr>
-      <w:r>
-        <w:rPr>
-          <w:sz w:val="20"/>
-          <w:szCs w:val="20"/>
-        </w:rPr>
-        <w:t>We use Sleuth and Zipkin together. Zipkin will give us a dashboard where we can see and track the requests from one micro service to another.</w:t>
-      </w:r>
-    </w:p>
-    <w:p>
-      <w:pPr>
-        <w:tabs>
-          <w:tab w:val="left" w:pos="1172"/>
-        </w:tabs>
-        <w:spacing w:after="0"/>
-        <w:rPr>
-          <w:sz w:val="20"/>
-          <w:szCs w:val="20"/>
-        </w:rPr>
-      </w:pPr>
-    </w:p>
-    <w:p>
-      <w:pPr>
-        <w:tabs>
-          <w:tab w:val="left" w:pos="1172"/>
-        </w:tabs>
-        <w:spacing w:after="0"/>
-        <w:rPr>
-          <w:sz w:val="20"/>
-          <w:szCs w:val="20"/>
-        </w:rPr>
-      </w:pPr>
-      <w:r>
-        <w:rPr>
-          <w:sz w:val="20"/>
-          <w:szCs w:val="20"/>
-        </w:rPr>
-        <w:t>2) What is Eureka and how do we use it?</w:t>
-      </w:r>
-    </w:p>
-    <w:p>
-      <w:pPr>
-        <w:tabs>
-          <w:tab w:val="left" w:pos="1172"/>
-        </w:tabs>
-        <w:spacing w:after="0"/>
-        <w:rPr>
-          <w:sz w:val="20"/>
-          <w:szCs w:val="20"/>
-        </w:rPr>
-      </w:pPr>
-      <w:r>
-        <w:rPr>
-          <w:sz w:val="20"/>
-          <w:szCs w:val="20"/>
-        </w:rPr>
-        <w:t xml:space="preserve">There will be multiple Microservices that require or communicate with each other through Restful </w:t>
-      </w:r>
-      <w:proofErr w:type="gramStart"/>
-      <w:r>
-        <w:rPr>
-          <w:sz w:val="20"/>
-          <w:szCs w:val="20"/>
-        </w:rPr>
-        <w:t>calls .</w:t>
-      </w:r>
-      <w:proofErr w:type="gramEnd"/>
-      <w:r>
-        <w:rPr>
-          <w:sz w:val="20"/>
-          <w:szCs w:val="20"/>
-        </w:rPr>
-        <w:t xml:space="preserve"> To do that the consumers will have to know the URL, the port number etc in order to communicate with the appropriate microservice.</w:t>
-      </w:r>
-    </w:p>
-    <w:p>
-      <w:pPr>
-        <w:tabs>
-          <w:tab w:val="left" w:pos="1172"/>
-        </w:tabs>
-        <w:spacing w:after="0"/>
-        <w:rPr>
-          <w:sz w:val="20"/>
-          <w:szCs w:val="20"/>
-        </w:rPr>
-      </w:pPr>
-      <w:r>
-        <w:rPr>
-          <w:sz w:val="20"/>
-          <w:szCs w:val="20"/>
-        </w:rPr>
-        <w:t xml:space="preserve">This will be very hard to maintain as there could be multiple instances of the same microservices running. That is where spring cloud offers naming services or a naming server called Eureka. Micro services will register themselves as soon as they start or come </w:t>
-      </w:r>
-      <w:proofErr w:type="gramStart"/>
-      <w:r>
-        <w:rPr>
-          <w:sz w:val="20"/>
-          <w:szCs w:val="20"/>
-        </w:rPr>
-        <w:t>up .They</w:t>
-      </w:r>
-      <w:proofErr w:type="gramEnd"/>
-      <w:r>
-        <w:rPr>
-          <w:sz w:val="20"/>
-          <w:szCs w:val="20"/>
-        </w:rPr>
-        <w:t xml:space="preserve"> will register using an application name or application ID which is a unique Id for each application and also the URL that is required to communicate with them.</w:t>
-      </w:r>
-    </w:p>
-    <w:p>
-      <w:pPr>
-        <w:tabs>
-          <w:tab w:val="left" w:pos="1172"/>
-        </w:tabs>
-        <w:spacing w:after="0"/>
-        <w:rPr>
-          <w:sz w:val="20"/>
-          <w:szCs w:val="20"/>
-        </w:rPr>
-      </w:pPr>
-      <w:r>
-        <w:rPr>
-          <w:noProof/>
-          <w:sz w:val="20"/>
-          <w:szCs w:val="20"/>
-        </w:rPr>
-        <w:lastRenderedPageBreak/>
-        <w:drawing>
-          <wp:inline distT="0" distB="0" distL="0" distR="0" wp14:anchorId="3086C742" wp14:editId="194A33DC">
-            <wp:extent cx="5631180" cy="3162300"/>
-            <wp:effectExtent l="0" t="0" r="7620" b="0"/>
-            <wp:docPr id="1501862103" name="Picture 11"/>
-            <wp:cNvGraphicFramePr>
-              <a:graphicFrameLocks xmlns:a="http://schemas.openxmlformats.org/drawingml/2006/main" noChangeAspect="1"/>
-            </wp:cNvGraphicFramePr>
-            <a:graphic xmlns:a="http://schemas.openxmlformats.org/drawingml/2006/main">
-              <a:graphicData uri="http://schemas.openxmlformats.org/drawingml/2006/picture">
-                <pic:pic xmlns:pic="http://schemas.openxmlformats.org/drawingml/2006/picture">
-                  <pic:nvPicPr>
-                    <pic:cNvPr id="0" name="Picture 32"/>
-                    <pic:cNvPicPr>
-                      <a:picLocks noChangeAspect="1" noChangeArrowheads="1"/>
-                    </pic:cNvPicPr>
-                  </pic:nvPicPr>
-                  <pic:blipFill>
-                    <a:blip r:embed="rId23" cstate="print">
-                      <a:extLst>
-                        <a:ext uri="{28A0092B-C50C-407E-A947-70E740481C1C}">
-                          <a14:useLocalDpi xmlns:a14="http://schemas.microsoft.com/office/drawing/2010/main" val="0"/>
-                        </a:ext>
-                      </a:extLst>
-                    </a:blip>
-                    <a:srcRect/>
-                    <a:stretch>
-                      <a:fillRect/>
-                    </a:stretch>
-                  </pic:blipFill>
-                  <pic:spPr bwMode="auto">
-                    <a:xfrm>
-                      <a:off x="0" y="0"/>
-                      <a:ext cx="5631180" cy="3162300"/>
-                    </a:xfrm>
-                    <a:prstGeom prst="rect">
-                      <a:avLst/>
-                    </a:prstGeom>
-                    <a:noFill/>
-                    <a:ln>
-                      <a:noFill/>
-                    </a:ln>
-                  </pic:spPr>
-                </pic:pic>
-              </a:graphicData>
-            </a:graphic>
-          </wp:inline>
-        </w:drawing>
-      </w:r>
-    </w:p>
-    <w:p>
-      <w:pPr>
-        <w:tabs>
-          <w:tab w:val="left" w:pos="1172"/>
-        </w:tabs>
-        <w:spacing w:after="0"/>
-        <w:rPr>
-          <w:sz w:val="20"/>
-          <w:szCs w:val="20"/>
-        </w:rPr>
-      </w:pPr>
-    </w:p>
-    <w:p>
-      <w:pPr>
-        <w:tabs>
-          <w:tab w:val="left" w:pos="1172"/>
-        </w:tabs>
-        <w:spacing w:after="0"/>
-        <w:rPr>
-          <w:sz w:val="20"/>
-          <w:szCs w:val="20"/>
-        </w:rPr>
-      </w:pPr>
-      <w:r>
-        <w:rPr>
-          <w:sz w:val="20"/>
-          <w:szCs w:val="20"/>
-        </w:rPr>
-        <w:t>Service consumers when they come up can communicate with the naming server to fetch those details based on just the application name. As long as the consumers know the unique application ID of the provider microservice they can fetch the URL and Port number.</w:t>
-      </w:r>
-    </w:p>
-    <w:p>
-      <w:pPr>
-        <w:tabs>
-          <w:tab w:val="left" w:pos="1172"/>
-        </w:tabs>
-        <w:spacing w:after="0"/>
-        <w:rPr>
-          <w:sz w:val="20"/>
-          <w:szCs w:val="20"/>
-        </w:rPr>
-      </w:pPr>
-      <w:r>
-        <w:rPr>
-          <w:sz w:val="20"/>
-          <w:szCs w:val="20"/>
-        </w:rPr>
-        <w:t xml:space="preserve">All that communication details will be maintained by the Eureka </w:t>
-      </w:r>
-      <w:proofErr w:type="gramStart"/>
-      <w:r>
-        <w:rPr>
-          <w:sz w:val="20"/>
-          <w:szCs w:val="20"/>
-        </w:rPr>
-        <w:t>server .Eureka</w:t>
-      </w:r>
-      <w:proofErr w:type="gramEnd"/>
-      <w:r>
-        <w:rPr>
-          <w:sz w:val="20"/>
-          <w:szCs w:val="20"/>
-        </w:rPr>
-        <w:t xml:space="preserve"> server will decouple these microservices and they can communicate with any other microservice through registration and discovery without maintaining any </w:t>
-      </w:r>
-      <w:proofErr w:type="spellStart"/>
-      <w:proofErr w:type="gramStart"/>
-      <w:r>
-        <w:rPr>
-          <w:sz w:val="20"/>
-          <w:szCs w:val="20"/>
-        </w:rPr>
-        <w:t>URL,Port</w:t>
-      </w:r>
-      <w:proofErr w:type="spellEnd"/>
-      <w:proofErr w:type="gramEnd"/>
-      <w:r>
-        <w:rPr>
-          <w:sz w:val="20"/>
-          <w:szCs w:val="20"/>
-        </w:rPr>
-        <w:t xml:space="preserve"> Etc that are required otherwise.</w:t>
-      </w:r>
-    </w:p>
-    <w:p>
-      <w:pPr>
-        <w:tabs>
-          <w:tab w:val="left" w:pos="1172"/>
-        </w:tabs>
-        <w:spacing w:after="0"/>
-        <w:rPr>
-          <w:sz w:val="20"/>
-          <w:szCs w:val="20"/>
-        </w:rPr>
-      </w:pPr>
-      <w:r>
-        <w:rPr>
-          <w:sz w:val="20"/>
-          <w:szCs w:val="20"/>
-        </w:rPr>
-        <w:t xml:space="preserve">We'll be registering our applications to start with the Eureka </w:t>
-      </w:r>
-      <w:proofErr w:type="gramStart"/>
-      <w:r>
-        <w:rPr>
-          <w:sz w:val="20"/>
-          <w:szCs w:val="20"/>
-        </w:rPr>
-        <w:t>server .</w:t>
-      </w:r>
-      <w:proofErr w:type="gramEnd"/>
-    </w:p>
-    <w:p>
-      <w:pPr>
-        <w:tabs>
-          <w:tab w:val="left" w:pos="1172"/>
-        </w:tabs>
-        <w:spacing w:after="0"/>
-        <w:rPr>
-          <w:sz w:val="20"/>
-          <w:szCs w:val="20"/>
-        </w:rPr>
-      </w:pPr>
-    </w:p>
-    <w:p>
-      <w:pPr>
-        <w:tabs>
-          <w:tab w:val="left" w:pos="1172"/>
-        </w:tabs>
-        <w:spacing w:after="0"/>
-        <w:rPr>
-          <w:sz w:val="20"/>
-          <w:szCs w:val="20"/>
-        </w:rPr>
-      </w:pPr>
-      <w:r>
-        <w:rPr>
-          <w:sz w:val="20"/>
-          <w:szCs w:val="20"/>
-        </w:rPr>
-        <w:t>How to use Eureka?</w:t>
-      </w:r>
-    </w:p>
-    <w:p>
-      <w:pPr>
-        <w:tabs>
-          <w:tab w:val="left" w:pos="1172"/>
-        </w:tabs>
-        <w:spacing w:after="0"/>
-        <w:rPr>
-          <w:sz w:val="20"/>
-          <w:szCs w:val="20"/>
-        </w:rPr>
-      </w:pPr>
-      <w:r>
-        <w:rPr>
-          <w:sz w:val="20"/>
-          <w:szCs w:val="20"/>
-        </w:rPr>
-        <w:t xml:space="preserve">Create </w:t>
-      </w:r>
-      <w:proofErr w:type="gramStart"/>
-      <w:r>
-        <w:rPr>
-          <w:sz w:val="20"/>
-          <w:szCs w:val="20"/>
-        </w:rPr>
-        <w:t>an</w:t>
-      </w:r>
-      <w:proofErr w:type="gramEnd"/>
-      <w:r>
-        <w:rPr>
-          <w:sz w:val="20"/>
-          <w:szCs w:val="20"/>
-        </w:rPr>
-        <w:t xml:space="preserve"> Eureka server of our </w:t>
-      </w:r>
-      <w:proofErr w:type="gramStart"/>
-      <w:r>
-        <w:rPr>
-          <w:sz w:val="20"/>
-          <w:szCs w:val="20"/>
-        </w:rPr>
-        <w:t>own .Create</w:t>
-      </w:r>
-      <w:proofErr w:type="gramEnd"/>
-      <w:r>
-        <w:rPr>
-          <w:sz w:val="20"/>
-          <w:szCs w:val="20"/>
-        </w:rPr>
-        <w:t xml:space="preserve"> a project with the Eureka Server dependency from Spring cloud starters from Netflix</w:t>
-      </w:r>
-    </w:p>
-    <w:p>
-      <w:pPr>
-        <w:tabs>
-          <w:tab w:val="left" w:pos="1172"/>
-        </w:tabs>
-        <w:spacing w:after="0"/>
-        <w:rPr>
-          <w:sz w:val="20"/>
-          <w:szCs w:val="20"/>
-        </w:rPr>
-      </w:pPr>
-    </w:p>
-    <w:p>
-      <w:pPr>
-        <w:tabs>
-          <w:tab w:val="left" w:pos="1172"/>
-        </w:tabs>
-        <w:spacing w:after="0"/>
-        <w:rPr>
-          <w:sz w:val="20"/>
-          <w:szCs w:val="20"/>
-        </w:rPr>
-      </w:pPr>
-      <w:r>
-        <w:rPr>
-          <w:sz w:val="20"/>
-          <w:szCs w:val="20"/>
-        </w:rPr>
-        <w:t>&lt;dependency&gt;</w:t>
-      </w:r>
-    </w:p>
-    <w:p>
-      <w:pPr>
-        <w:tabs>
-          <w:tab w:val="left" w:pos="1172"/>
-        </w:tabs>
-        <w:spacing w:after="0"/>
-        <w:rPr>
-          <w:sz w:val="20"/>
-          <w:szCs w:val="20"/>
-        </w:rPr>
-      </w:pPr>
-      <w:proofErr w:type="gramStart"/>
-      <w:r>
-        <w:rPr>
-          <w:sz w:val="20"/>
-          <w:szCs w:val="20"/>
-        </w:rPr>
-        <w:t>&lt;</w:t>
-      </w:r>
-      <w:proofErr w:type="spellStart"/>
-      <w:r>
-        <w:rPr>
-          <w:sz w:val="20"/>
-          <w:szCs w:val="20"/>
-        </w:rPr>
-        <w:t>groupId</w:t>
-      </w:r>
-      <w:proofErr w:type="spellEnd"/>
-      <w:r>
-        <w:rPr>
-          <w:sz w:val="20"/>
-          <w:szCs w:val="20"/>
-        </w:rPr>
-        <w:t>&gt;</w:t>
-      </w:r>
-      <w:proofErr w:type="spellStart"/>
-      <w:r>
-        <w:rPr>
-          <w:sz w:val="20"/>
-          <w:szCs w:val="20"/>
-        </w:rPr>
-        <w:t>org.springframework.cloud</w:t>
-      </w:r>
-      <w:proofErr w:type="spellEnd"/>
-      <w:proofErr w:type="gramEnd"/>
-      <w:r>
-        <w:rPr>
-          <w:sz w:val="20"/>
-          <w:szCs w:val="20"/>
-        </w:rPr>
-        <w:t>&lt;/</w:t>
-      </w:r>
-      <w:proofErr w:type="spellStart"/>
-      <w:r>
-        <w:rPr>
-          <w:sz w:val="20"/>
-          <w:szCs w:val="20"/>
-        </w:rPr>
-        <w:t>groupId</w:t>
-      </w:r>
-      <w:proofErr w:type="spellEnd"/>
-      <w:r>
-        <w:rPr>
-          <w:sz w:val="20"/>
-          <w:szCs w:val="20"/>
-        </w:rPr>
-        <w:t>&gt;</w:t>
-      </w:r>
-    </w:p>
-    <w:p>
-      <w:pPr>
-        <w:tabs>
-          <w:tab w:val="left" w:pos="1172"/>
-        </w:tabs>
-        <w:spacing w:after="0"/>
-        <w:rPr>
-          <w:sz w:val="20"/>
-          <w:szCs w:val="20"/>
-        </w:rPr>
-      </w:pPr>
-      <w:r>
-        <w:rPr>
-          <w:sz w:val="20"/>
-          <w:szCs w:val="20"/>
-        </w:rPr>
-        <w:t>&lt;artifactId&gt;spring-cloud-starter-netflix-eureka-server&lt;/artifactId&gt;</w:t>
-      </w:r>
-    </w:p>
-    <w:p>
-      <w:pPr>
-        <w:tabs>
-          <w:tab w:val="left" w:pos="1172"/>
-        </w:tabs>
-        <w:spacing w:after="0"/>
-        <w:rPr>
-          <w:sz w:val="20"/>
-          <w:szCs w:val="20"/>
-        </w:rPr>
-      </w:pPr>
-      <w:r>
-        <w:rPr>
-          <w:sz w:val="20"/>
-          <w:szCs w:val="20"/>
-        </w:rPr>
-        <w:t>&lt;/dependency&gt;</w:t>
-      </w:r>
-    </w:p>
-    <w:p>
-      <w:pPr>
-        <w:tabs>
-          <w:tab w:val="left" w:pos="1172"/>
-        </w:tabs>
-        <w:spacing w:after="0"/>
-        <w:rPr>
-          <w:sz w:val="20"/>
-          <w:szCs w:val="20"/>
-        </w:rPr>
-      </w:pPr>
-      <w:r>
-        <w:rPr>
-          <w:sz w:val="20"/>
-          <w:szCs w:val="20"/>
-        </w:rPr>
-        <w:t>And on the Application class of this project add @EnableEurekaServer annotation that tells spring that this particular project is a Eureka Server</w:t>
-      </w:r>
-    </w:p>
-    <w:p>
-      <w:pPr>
-        <w:tabs>
-          <w:tab w:val="left" w:pos="1172"/>
-        </w:tabs>
-        <w:spacing w:after="0"/>
-        <w:rPr>
-          <w:sz w:val="20"/>
-          <w:szCs w:val="20"/>
-        </w:rPr>
-      </w:pPr>
-    </w:p>
-    <w:p>
-      <w:pPr>
-        <w:tabs>
-          <w:tab w:val="left" w:pos="1172"/>
-        </w:tabs>
-        <w:spacing w:after="0"/>
-        <w:rPr>
-          <w:sz w:val="20"/>
-          <w:szCs w:val="20"/>
-        </w:rPr>
-      </w:pPr>
-      <w:r>
-        <w:rPr>
-          <w:sz w:val="20"/>
-          <w:szCs w:val="20"/>
-        </w:rPr>
-        <w:t xml:space="preserve">And on the </w:t>
-      </w:r>
-      <w:proofErr w:type="gramStart"/>
-      <w:r>
-        <w:rPr>
-          <w:sz w:val="20"/>
-          <w:szCs w:val="20"/>
-        </w:rPr>
-        <w:t>clients</w:t>
-      </w:r>
-      <w:proofErr w:type="gramEnd"/>
-      <w:r>
-        <w:rPr>
-          <w:sz w:val="20"/>
-          <w:szCs w:val="20"/>
-        </w:rPr>
-        <w:t xml:space="preserve"> we use the following:</w:t>
-      </w:r>
-    </w:p>
-    <w:p>
-      <w:pPr>
-        <w:tabs>
-          <w:tab w:val="left" w:pos="1172"/>
-        </w:tabs>
-        <w:spacing w:after="0"/>
-        <w:rPr>
-          <w:sz w:val="20"/>
-          <w:szCs w:val="20"/>
-        </w:rPr>
-      </w:pPr>
-      <w:r>
-        <w:rPr>
-          <w:sz w:val="20"/>
-          <w:szCs w:val="20"/>
-        </w:rPr>
-        <w:t>&lt;dependency&gt;</w:t>
-      </w:r>
-    </w:p>
-    <w:p>
-      <w:pPr>
-        <w:tabs>
-          <w:tab w:val="left" w:pos="1172"/>
-        </w:tabs>
-        <w:spacing w:after="0"/>
-        <w:rPr>
-          <w:sz w:val="20"/>
-          <w:szCs w:val="20"/>
-        </w:rPr>
-      </w:pPr>
-      <w:proofErr w:type="gramStart"/>
-      <w:r>
-        <w:rPr>
-          <w:sz w:val="20"/>
-          <w:szCs w:val="20"/>
-        </w:rPr>
-        <w:t>&lt;</w:t>
-      </w:r>
-      <w:proofErr w:type="spellStart"/>
-      <w:r>
-        <w:rPr>
-          <w:sz w:val="20"/>
-          <w:szCs w:val="20"/>
-        </w:rPr>
-        <w:t>groupId</w:t>
-      </w:r>
-      <w:proofErr w:type="spellEnd"/>
-      <w:r>
-        <w:rPr>
-          <w:sz w:val="20"/>
-          <w:szCs w:val="20"/>
-        </w:rPr>
-        <w:t>&gt;</w:t>
-      </w:r>
-      <w:proofErr w:type="spellStart"/>
-      <w:r>
-        <w:rPr>
-          <w:sz w:val="20"/>
-          <w:szCs w:val="20"/>
-        </w:rPr>
-        <w:t>org.springframework.cloud</w:t>
-      </w:r>
-      <w:proofErr w:type="spellEnd"/>
-      <w:proofErr w:type="gramEnd"/>
-      <w:r>
-        <w:rPr>
-          <w:sz w:val="20"/>
-          <w:szCs w:val="20"/>
-        </w:rPr>
-        <w:t>&lt;/</w:t>
-      </w:r>
-      <w:proofErr w:type="spellStart"/>
-      <w:r>
-        <w:rPr>
-          <w:sz w:val="20"/>
-          <w:szCs w:val="20"/>
-        </w:rPr>
-        <w:t>groupId</w:t>
-      </w:r>
-      <w:proofErr w:type="spellEnd"/>
-      <w:r>
-        <w:rPr>
-          <w:sz w:val="20"/>
-          <w:szCs w:val="20"/>
-        </w:rPr>
-        <w:t>&gt;</w:t>
-      </w:r>
-    </w:p>
-    <w:p>
-      <w:pPr>
-        <w:tabs>
-          <w:tab w:val="left" w:pos="1172"/>
-        </w:tabs>
-        <w:spacing w:after="0"/>
-        <w:rPr>
-          <w:sz w:val="20"/>
-          <w:szCs w:val="20"/>
-        </w:rPr>
-      </w:pPr>
-      <w:r>
-        <w:rPr>
-          <w:sz w:val="20"/>
-          <w:szCs w:val="20"/>
-        </w:rPr>
-        <w:t>&lt;artifactId&gt;spring-cloud-starter-netflix-eureka-client&lt;/artifactId&gt;</w:t>
-      </w:r>
-    </w:p>
-    <w:p>
-      <w:pPr>
-        <w:tabs>
-          <w:tab w:val="left" w:pos="1172"/>
-        </w:tabs>
-        <w:spacing w:after="0"/>
-        <w:rPr>
-          <w:sz w:val="20"/>
-          <w:szCs w:val="20"/>
-        </w:rPr>
-      </w:pPr>
-      <w:r>
-        <w:rPr>
-          <w:sz w:val="20"/>
-          <w:szCs w:val="20"/>
-        </w:rPr>
-        <w:t>&lt;/dependency&gt;</w:t>
-      </w:r>
-    </w:p>
-    <w:p>
-      <w:pPr>
-        <w:tabs>
-          <w:tab w:val="left" w:pos="1172"/>
-        </w:tabs>
-        <w:spacing w:after="0"/>
-        <w:rPr>
-          <w:sz w:val="20"/>
-          <w:szCs w:val="20"/>
-        </w:rPr>
-      </w:pPr>
-    </w:p>
-    <w:p>
-      <w:pPr>
-        <w:tabs>
-          <w:tab w:val="left" w:pos="1172"/>
-        </w:tabs>
-        <w:spacing w:after="0"/>
-        <w:rPr>
-          <w:sz w:val="20"/>
-          <w:szCs w:val="20"/>
-        </w:rPr>
-      </w:pPr>
-      <w:r>
-        <w:rPr>
-          <w:sz w:val="20"/>
-          <w:szCs w:val="20"/>
-        </w:rPr>
-        <w:t>@EnableEurekaClient</w:t>
-      </w:r>
-    </w:p>
-    <w:p>
-      <w:pPr>
-        <w:tabs>
-          <w:tab w:val="left" w:pos="1172"/>
-        </w:tabs>
-        <w:spacing w:after="0"/>
-        <w:rPr>
-          <w:sz w:val="20"/>
-          <w:szCs w:val="20"/>
-        </w:rPr>
-      </w:pPr>
-    </w:p>
-    <w:p>
-      <w:pPr>
-        <w:tabs>
-          <w:tab w:val="left" w:pos="1172"/>
-        </w:tabs>
-        <w:spacing w:after="0"/>
-        <w:rPr>
-          <w:sz w:val="20"/>
-          <w:szCs w:val="20"/>
-        </w:rPr>
-      </w:pPr>
-      <w:r>
-        <w:rPr>
-          <w:sz w:val="20"/>
-          <w:szCs w:val="20"/>
-        </w:rPr>
-        <w:t>spring.application.name=coupon-service</w:t>
-      </w:r>
-    </w:p>
-    <w:p>
-      <w:pPr>
-        <w:tabs>
-          <w:tab w:val="left" w:pos="1172"/>
-        </w:tabs>
-        <w:spacing w:after="0"/>
-        <w:rPr>
-          <w:sz w:val="20"/>
-          <w:szCs w:val="20"/>
-        </w:rPr>
-      </w:pPr>
-      <w:proofErr w:type="gramStart"/>
-      <w:r>
-        <w:rPr>
-          <w:sz w:val="20"/>
-          <w:szCs w:val="20"/>
-        </w:rPr>
-        <w:t>eureka.client</w:t>
-      </w:r>
-      <w:proofErr w:type="gramEnd"/>
-      <w:r>
-        <w:rPr>
-          <w:sz w:val="20"/>
-          <w:szCs w:val="20"/>
-        </w:rPr>
-        <w:t>.service-</w:t>
-      </w:r>
-      <w:proofErr w:type="gramStart"/>
-      <w:r>
-        <w:rPr>
-          <w:sz w:val="20"/>
-          <w:szCs w:val="20"/>
-        </w:rPr>
-        <w:t>url.defaultZone</w:t>
-      </w:r>
-      <w:proofErr w:type="gramEnd"/>
-      <w:r>
-        <w:rPr>
-          <w:sz w:val="20"/>
-          <w:szCs w:val="20"/>
-        </w:rPr>
-        <w:t>=http://localhost:8761/eureka/</w:t>
-      </w:r>
-    </w:p>
-    <w:p>
-      <w:pPr>
-        <w:tabs>
-          <w:tab w:val="left" w:pos="1172"/>
-        </w:tabs>
-        <w:spacing w:after="0"/>
-        <w:rPr>
-          <w:sz w:val="20"/>
-          <w:szCs w:val="20"/>
-        </w:rPr>
-      </w:pPr>
-      <w:r>
-        <w:rPr>
-          <w:sz w:val="20"/>
-          <w:szCs w:val="20"/>
-        </w:rPr>
-        <w:t>Once you do that and you start your application automatically these applications will register themselves with the Eureka server using the application name which we provide in the application or properties.</w:t>
-      </w:r>
-    </w:p>
-    <w:p>
-      <w:pPr>
-        <w:tabs>
-          <w:tab w:val="left" w:pos="1172"/>
-        </w:tabs>
-        <w:spacing w:after="0"/>
-        <w:rPr>
-          <w:sz w:val="20"/>
-          <w:szCs w:val="20"/>
-        </w:rPr>
-      </w:pPr>
-    </w:p>
-    <w:p>
-      <w:pPr>
-        <w:tabs>
-          <w:tab w:val="left" w:pos="1172"/>
-        </w:tabs>
-        <w:spacing w:after="0"/>
-        <w:rPr>
-          <w:sz w:val="20"/>
-          <w:szCs w:val="20"/>
-        </w:rPr>
-      </w:pPr>
-      <w:r>
-        <w:rPr>
-          <w:sz w:val="20"/>
-          <w:szCs w:val="20"/>
-        </w:rPr>
-        <w:t>And then other micro services can use this name and communicate with that particular micro service. We provide the Eureka server URL as a property in the client projects as well.</w:t>
-      </w:r>
-    </w:p>
-    <w:p>
-      <w:pPr>
-        <w:tabs>
-          <w:tab w:val="left" w:pos="1172"/>
-        </w:tabs>
-        <w:spacing w:after="0"/>
-        <w:rPr>
-          <w:sz w:val="20"/>
-          <w:szCs w:val="20"/>
-        </w:rPr>
-      </w:pPr>
-    </w:p>
-    <w:p>
-      <w:pPr>
-        <w:tabs>
-          <w:tab w:val="left" w:pos="1172"/>
-        </w:tabs>
-        <w:spacing w:after="0"/>
-        <w:rPr>
-          <w:sz w:val="20"/>
-          <w:szCs w:val="20"/>
-        </w:rPr>
-      </w:pPr>
-      <w:r>
-        <w:rPr>
-          <w:sz w:val="20"/>
-          <w:szCs w:val="20"/>
-        </w:rPr>
-        <w:t xml:space="preserve">3) What is Ribbon or What and how to use </w:t>
-      </w:r>
-      <w:proofErr w:type="gramStart"/>
-      <w:r>
-        <w:rPr>
-          <w:sz w:val="20"/>
-          <w:szCs w:val="20"/>
-        </w:rPr>
-        <w:t>client side</w:t>
-      </w:r>
-      <w:proofErr w:type="gramEnd"/>
-      <w:r>
-        <w:rPr>
-          <w:sz w:val="20"/>
-          <w:szCs w:val="20"/>
-        </w:rPr>
-        <w:t xml:space="preserve"> load balancing?</w:t>
-      </w:r>
-    </w:p>
-    <w:p>
-      <w:pPr>
-        <w:tabs>
-          <w:tab w:val="left" w:pos="1172"/>
-        </w:tabs>
-        <w:spacing w:after="0"/>
-        <w:rPr>
-          <w:sz w:val="20"/>
-          <w:szCs w:val="20"/>
-        </w:rPr>
-      </w:pPr>
-    </w:p>
-    <w:p>
-      <w:pPr>
-        <w:tabs>
-          <w:tab w:val="left" w:pos="1172"/>
-        </w:tabs>
-        <w:spacing w:after="0"/>
-        <w:rPr>
-          <w:sz w:val="20"/>
-          <w:szCs w:val="20"/>
-        </w:rPr>
-      </w:pPr>
-      <w:r>
-        <w:rPr>
-          <w:sz w:val="20"/>
-          <w:szCs w:val="20"/>
-        </w:rPr>
-        <w:t xml:space="preserve">As the number of requests to our micro services </w:t>
-      </w:r>
-      <w:proofErr w:type="gramStart"/>
-      <w:r>
-        <w:rPr>
-          <w:sz w:val="20"/>
-          <w:szCs w:val="20"/>
-        </w:rPr>
-        <w:t>increase</w:t>
-      </w:r>
-      <w:proofErr w:type="gramEnd"/>
-      <w:r>
-        <w:rPr>
-          <w:sz w:val="20"/>
-          <w:szCs w:val="20"/>
-        </w:rPr>
-        <w:t xml:space="preserve"> we will be scaling our application across different </w:t>
-      </w:r>
-      <w:proofErr w:type="spellStart"/>
-      <w:proofErr w:type="gramStart"/>
-      <w:r>
-        <w:rPr>
-          <w:sz w:val="20"/>
-          <w:szCs w:val="20"/>
-        </w:rPr>
-        <w:t>servers.There</w:t>
-      </w:r>
-      <w:proofErr w:type="spellEnd"/>
-      <w:proofErr w:type="gramEnd"/>
-      <w:r>
-        <w:rPr>
-          <w:sz w:val="20"/>
-          <w:szCs w:val="20"/>
-        </w:rPr>
-        <w:t xml:space="preserve"> will be multiple instances of the same microservice running on different servers so that the client can make calls to one of these instances as required.</w:t>
-      </w:r>
-    </w:p>
-    <w:p>
-      <w:pPr>
-        <w:tabs>
-          <w:tab w:val="left" w:pos="1172"/>
-        </w:tabs>
-        <w:spacing w:after="0"/>
-        <w:rPr>
-          <w:sz w:val="20"/>
-          <w:szCs w:val="20"/>
-        </w:rPr>
-      </w:pPr>
-      <w:r>
-        <w:rPr>
-          <w:noProof/>
-          <w:sz w:val="20"/>
-          <w:szCs w:val="20"/>
-        </w:rPr>
-        <w:lastRenderedPageBreak/>
-        <w:drawing>
-          <wp:inline distT="0" distB="0" distL="0" distR="0" wp14:anchorId="3D9700E0" wp14:editId="3D23964F">
-            <wp:extent cx="7200900" cy="4050665"/>
-            <wp:effectExtent l="0" t="0" r="0" b="6985"/>
-            <wp:docPr id="979715023" name="Picture 10"/>
-            <wp:cNvGraphicFramePr>
-              <a:graphicFrameLocks xmlns:a="http://schemas.openxmlformats.org/drawingml/2006/main" noChangeAspect="1"/>
-            </wp:cNvGraphicFramePr>
-            <a:graphic xmlns:a="http://schemas.openxmlformats.org/drawingml/2006/main">
-              <a:graphicData uri="http://schemas.openxmlformats.org/drawingml/2006/picture">
-                <pic:pic xmlns:pic="http://schemas.openxmlformats.org/drawingml/2006/picture">
-                  <pic:nvPicPr>
-                    <pic:cNvPr id="0" name="Picture 33"/>
-                    <pic:cNvPicPr>
-                      <a:picLocks noChangeAspect="1" noChangeArrowheads="1"/>
-                    </pic:cNvPicPr>
-                  </pic:nvPicPr>
-                  <pic:blipFill>
-                    <a:blip r:embed="rId24" cstate="print">
-                      <a:extLst>
-                        <a:ext uri="{28A0092B-C50C-407E-A947-70E740481C1C}">
-                          <a14:useLocalDpi xmlns:a14="http://schemas.microsoft.com/office/drawing/2010/main" val="0"/>
-                        </a:ext>
-                      </a:extLst>
-                    </a:blip>
-                    <a:srcRect/>
-                    <a:stretch>
-                      <a:fillRect/>
-                    </a:stretch>
-                  </pic:blipFill>
-                  <pic:spPr bwMode="auto">
-                    <a:xfrm>
-                      <a:off x="0" y="0"/>
-                      <a:ext cx="7200900" cy="4050665"/>
-                    </a:xfrm>
-                    <a:prstGeom prst="rect">
-                      <a:avLst/>
-                    </a:prstGeom>
-                    <a:noFill/>
-                    <a:ln>
-                      <a:noFill/>
-                    </a:ln>
-                  </pic:spPr>
-                </pic:pic>
-              </a:graphicData>
-            </a:graphic>
-          </wp:inline>
-        </w:drawing>
-      </w:r>
-    </w:p>
-    <w:p>
-      <w:pPr>
-        <w:tabs>
-          <w:tab w:val="left" w:pos="1172"/>
-        </w:tabs>
-        <w:spacing w:after="0"/>
-        <w:rPr>
-          <w:sz w:val="20"/>
-          <w:szCs w:val="20"/>
-        </w:rPr>
-      </w:pPr>
-    </w:p>
-    <w:p>
-      <w:pPr>
-        <w:tabs>
-          <w:tab w:val="left" w:pos="1172"/>
-        </w:tabs>
-        <w:spacing w:after="0"/>
-        <w:rPr>
-          <w:sz w:val="20"/>
-          <w:szCs w:val="20"/>
-        </w:rPr>
-      </w:pPr>
-      <w:proofErr w:type="gramStart"/>
-      <w:r>
-        <w:rPr>
-          <w:sz w:val="20"/>
-          <w:szCs w:val="20"/>
-        </w:rPr>
-        <w:t>Client side</w:t>
-      </w:r>
-      <w:proofErr w:type="gramEnd"/>
-      <w:r>
-        <w:rPr>
-          <w:sz w:val="20"/>
-          <w:szCs w:val="20"/>
-        </w:rPr>
-        <w:t xml:space="preserve"> Load balancing is done using Ribbon from Spring </w:t>
-      </w:r>
-      <w:proofErr w:type="gramStart"/>
-      <w:r>
-        <w:rPr>
-          <w:sz w:val="20"/>
-          <w:szCs w:val="20"/>
-        </w:rPr>
-        <w:t>cloud .Feign</w:t>
-      </w:r>
-      <w:proofErr w:type="gramEnd"/>
-      <w:r>
-        <w:rPr>
-          <w:sz w:val="20"/>
-          <w:szCs w:val="20"/>
-        </w:rPr>
-        <w:t xml:space="preserve"> client also a Spring Cloud component which allows easy Rest Client creation works with Ribbon and the load will be balanced from the client side </w:t>
-      </w:r>
-      <w:proofErr w:type="spellStart"/>
-      <w:proofErr w:type="gramStart"/>
-      <w:r>
-        <w:rPr>
-          <w:sz w:val="20"/>
-          <w:szCs w:val="20"/>
-        </w:rPr>
-        <w:t>itself.The</w:t>
-      </w:r>
-      <w:proofErr w:type="spellEnd"/>
-      <w:proofErr w:type="gramEnd"/>
-      <w:r>
-        <w:rPr>
-          <w:sz w:val="20"/>
-          <w:szCs w:val="20"/>
-        </w:rPr>
-        <w:t xml:space="preserve"> client will decide to which instance the request should go to.</w:t>
-      </w:r>
-    </w:p>
-    <w:p>
-      <w:pPr>
-        <w:tabs>
-          <w:tab w:val="left" w:pos="1172"/>
-        </w:tabs>
-        <w:spacing w:after="0"/>
-        <w:rPr>
-          <w:sz w:val="20"/>
-          <w:szCs w:val="20"/>
-        </w:rPr>
-      </w:pPr>
-      <w:r>
-        <w:rPr>
-          <w:sz w:val="20"/>
-          <w:szCs w:val="20"/>
-        </w:rPr>
-        <w:t xml:space="preserve">Configuring Ribbon is easy in the </w:t>
-      </w:r>
-      <w:proofErr w:type="spellStart"/>
-      <w:proofErr w:type="gramStart"/>
-      <w:r>
-        <w:rPr>
-          <w:sz w:val="20"/>
-          <w:szCs w:val="20"/>
-        </w:rPr>
-        <w:t>pom.xml.Just</w:t>
-      </w:r>
-      <w:proofErr w:type="spellEnd"/>
-      <w:proofErr w:type="gramEnd"/>
-      <w:r>
-        <w:rPr>
-          <w:sz w:val="20"/>
-          <w:szCs w:val="20"/>
-        </w:rPr>
-        <w:t xml:space="preserve"> Add</w:t>
-      </w:r>
-    </w:p>
-    <w:p>
-      <w:pPr>
-        <w:tabs>
-          <w:tab w:val="left" w:pos="1172"/>
-        </w:tabs>
-        <w:spacing w:after="0"/>
-        <w:rPr>
-          <w:sz w:val="20"/>
-          <w:szCs w:val="20"/>
-        </w:rPr>
-      </w:pPr>
-      <w:r>
-        <w:rPr>
-          <w:sz w:val="20"/>
-          <w:szCs w:val="20"/>
-        </w:rPr>
-        <w:t>&lt;dependency&gt;</w:t>
-      </w:r>
-    </w:p>
-    <w:p>
-      <w:pPr>
-        <w:tabs>
-          <w:tab w:val="left" w:pos="1172"/>
-        </w:tabs>
-        <w:spacing w:after="0"/>
-        <w:rPr>
-          <w:sz w:val="20"/>
-          <w:szCs w:val="20"/>
-        </w:rPr>
-      </w:pPr>
-      <w:proofErr w:type="gramStart"/>
-      <w:r>
-        <w:rPr>
-          <w:sz w:val="20"/>
-          <w:szCs w:val="20"/>
-        </w:rPr>
-        <w:t>&lt;</w:t>
-      </w:r>
-      <w:proofErr w:type="spellStart"/>
-      <w:r>
-        <w:rPr>
-          <w:sz w:val="20"/>
-          <w:szCs w:val="20"/>
-        </w:rPr>
-        <w:t>groupId</w:t>
-      </w:r>
-      <w:proofErr w:type="spellEnd"/>
-      <w:r>
-        <w:rPr>
-          <w:sz w:val="20"/>
-          <w:szCs w:val="20"/>
-        </w:rPr>
-        <w:t>&gt;</w:t>
-      </w:r>
-      <w:proofErr w:type="spellStart"/>
-      <w:r>
-        <w:rPr>
-          <w:sz w:val="20"/>
-          <w:szCs w:val="20"/>
-        </w:rPr>
-        <w:t>org.springframework.cloud</w:t>
-      </w:r>
-      <w:proofErr w:type="spellEnd"/>
-      <w:proofErr w:type="gramEnd"/>
-      <w:r>
-        <w:rPr>
-          <w:sz w:val="20"/>
-          <w:szCs w:val="20"/>
-        </w:rPr>
-        <w:t>&lt;/</w:t>
-      </w:r>
-      <w:proofErr w:type="spellStart"/>
-      <w:r>
-        <w:rPr>
-          <w:sz w:val="20"/>
-          <w:szCs w:val="20"/>
-        </w:rPr>
-        <w:t>groupId</w:t>
-      </w:r>
-      <w:proofErr w:type="spellEnd"/>
-      <w:r>
-        <w:rPr>
-          <w:sz w:val="20"/>
-          <w:szCs w:val="20"/>
-        </w:rPr>
-        <w:t>&gt;</w:t>
-      </w:r>
-    </w:p>
-    <w:p>
-      <w:pPr>
-        <w:tabs>
-          <w:tab w:val="left" w:pos="1172"/>
-        </w:tabs>
-        <w:spacing w:after="0"/>
-        <w:rPr>
-          <w:sz w:val="20"/>
-          <w:szCs w:val="20"/>
-        </w:rPr>
-      </w:pPr>
-      <w:r>
-        <w:rPr>
-          <w:sz w:val="20"/>
-          <w:szCs w:val="20"/>
-        </w:rPr>
-        <w:t>&lt;</w:t>
-      </w:r>
-      <w:proofErr w:type="spellStart"/>
-      <w:r>
-        <w:rPr>
-          <w:sz w:val="20"/>
-          <w:szCs w:val="20"/>
-        </w:rPr>
-        <w:t>artifactId</w:t>
-      </w:r>
-      <w:proofErr w:type="spellEnd"/>
-      <w:r>
-        <w:rPr>
-          <w:sz w:val="20"/>
-          <w:szCs w:val="20"/>
-        </w:rPr>
-        <w:t>&gt;spring-cloud-starter-</w:t>
-      </w:r>
-      <w:proofErr w:type="spellStart"/>
-      <w:r>
-        <w:rPr>
-          <w:sz w:val="20"/>
-          <w:szCs w:val="20"/>
-        </w:rPr>
-        <w:t>netflix</w:t>
-      </w:r>
-      <w:proofErr w:type="spellEnd"/>
-      <w:r>
-        <w:rPr>
-          <w:sz w:val="20"/>
-          <w:szCs w:val="20"/>
-        </w:rPr>
-        <w:t>-ribbon&lt;/</w:t>
-      </w:r>
-      <w:proofErr w:type="spellStart"/>
-      <w:r>
-        <w:rPr>
-          <w:sz w:val="20"/>
-          <w:szCs w:val="20"/>
-        </w:rPr>
-        <w:t>artifactId</w:t>
-      </w:r>
-      <w:proofErr w:type="spellEnd"/>
-      <w:r>
-        <w:rPr>
-          <w:sz w:val="20"/>
-          <w:szCs w:val="20"/>
-        </w:rPr>
-        <w:t>&gt;</w:t>
-      </w:r>
-    </w:p>
-    <w:p>
-      <w:pPr>
-        <w:tabs>
-          <w:tab w:val="left" w:pos="1172"/>
-        </w:tabs>
-        <w:spacing w:after="0"/>
-        <w:rPr>
-          <w:sz w:val="20"/>
-          <w:szCs w:val="20"/>
-        </w:rPr>
-      </w:pPr>
-      <w:r>
-        <w:rPr>
-          <w:sz w:val="20"/>
-          <w:szCs w:val="20"/>
-        </w:rPr>
-        <w:t>&lt;/dependency&gt;</w:t>
-      </w:r>
-    </w:p>
-    <w:p>
-      <w:pPr>
-        <w:tabs>
-          <w:tab w:val="left" w:pos="1172"/>
-        </w:tabs>
-        <w:spacing w:after="0"/>
-        <w:rPr>
-          <w:sz w:val="20"/>
-          <w:szCs w:val="20"/>
-        </w:rPr>
-      </w:pPr>
-    </w:p>
-    <w:p>
-      <w:pPr>
-        <w:tabs>
-          <w:tab w:val="left" w:pos="1172"/>
-        </w:tabs>
-        <w:spacing w:after="0"/>
-        <w:rPr>
-          <w:sz w:val="20"/>
-          <w:szCs w:val="20"/>
-        </w:rPr>
-      </w:pPr>
-      <w:r>
-        <w:rPr>
-          <w:sz w:val="20"/>
-          <w:szCs w:val="20"/>
-        </w:rPr>
-        <w:t xml:space="preserve">4) What is </w:t>
-      </w:r>
-      <w:proofErr w:type="spellStart"/>
-      <w:r>
-        <w:rPr>
-          <w:sz w:val="20"/>
-          <w:szCs w:val="20"/>
-        </w:rPr>
-        <w:t>Zuul</w:t>
-      </w:r>
-      <w:proofErr w:type="spellEnd"/>
-      <w:r>
-        <w:rPr>
-          <w:sz w:val="20"/>
-          <w:szCs w:val="20"/>
-        </w:rPr>
-        <w:t xml:space="preserve"> Proxy</w:t>
-      </w:r>
-    </w:p>
-    <w:p>
-      <w:pPr>
-        <w:tabs>
-          <w:tab w:val="left" w:pos="1172"/>
-        </w:tabs>
-        <w:spacing w:after="0"/>
-        <w:rPr>
-          <w:sz w:val="20"/>
-          <w:szCs w:val="20"/>
-        </w:rPr>
-      </w:pPr>
-    </w:p>
-    <w:p>
-      <w:pPr>
-        <w:tabs>
-          <w:tab w:val="left" w:pos="1172"/>
-        </w:tabs>
-        <w:spacing w:after="0"/>
-        <w:rPr>
-          <w:sz w:val="20"/>
-          <w:szCs w:val="20"/>
-        </w:rPr>
-      </w:pPr>
-      <w:r>
-        <w:rPr>
-          <w:sz w:val="20"/>
-          <w:szCs w:val="20"/>
-        </w:rPr>
-        <w:t>There will be some non-functional requirements that are common across micro services.</w:t>
-      </w:r>
-    </w:p>
-    <w:p>
-      <w:pPr>
-        <w:tabs>
-          <w:tab w:val="left" w:pos="1172"/>
-        </w:tabs>
-        <w:spacing w:after="0"/>
-        <w:rPr>
-          <w:sz w:val="20"/>
-          <w:szCs w:val="20"/>
-        </w:rPr>
-      </w:pPr>
-      <w:r>
-        <w:rPr>
-          <w:sz w:val="20"/>
-          <w:szCs w:val="20"/>
-        </w:rPr>
-        <w:t xml:space="preserve">For </w:t>
-      </w:r>
-      <w:proofErr w:type="gramStart"/>
-      <w:r>
-        <w:rPr>
-          <w:sz w:val="20"/>
-          <w:szCs w:val="20"/>
-        </w:rPr>
-        <w:t>example</w:t>
-      </w:r>
-      <w:proofErr w:type="gramEnd"/>
-      <w:r>
-        <w:rPr>
-          <w:sz w:val="20"/>
-          <w:szCs w:val="20"/>
-        </w:rPr>
-        <w:t xml:space="preserve"> security where the client needs to authenticate and authorize with a particular </w:t>
-      </w:r>
-      <w:proofErr w:type="gramStart"/>
-      <w:r>
-        <w:rPr>
-          <w:sz w:val="20"/>
-          <w:szCs w:val="20"/>
-        </w:rPr>
-        <w:t>microservice ,tracing</w:t>
-      </w:r>
-      <w:proofErr w:type="gramEnd"/>
-      <w:r>
-        <w:rPr>
-          <w:sz w:val="20"/>
-          <w:szCs w:val="20"/>
-        </w:rPr>
-        <w:t xml:space="preserve"> where we need to trace the request as it goes from one micro service to another, service aggregation, </w:t>
-      </w:r>
-      <w:proofErr w:type="spellStart"/>
-      <w:r>
-        <w:rPr>
-          <w:sz w:val="20"/>
-          <w:szCs w:val="20"/>
-        </w:rPr>
-        <w:t>i.e</w:t>
-      </w:r>
-      <w:proofErr w:type="spellEnd"/>
-      <w:r>
-        <w:rPr>
-          <w:sz w:val="20"/>
-          <w:szCs w:val="20"/>
-        </w:rPr>
-        <w:t xml:space="preserve"> if we have calls that need to go from the client to multiple micro </w:t>
-      </w:r>
-      <w:proofErr w:type="gramStart"/>
-      <w:r>
-        <w:rPr>
-          <w:sz w:val="20"/>
-          <w:szCs w:val="20"/>
-        </w:rPr>
-        <w:t>services .</w:t>
-      </w:r>
-      <w:proofErr w:type="gramEnd"/>
-      <w:r>
-        <w:rPr>
-          <w:sz w:val="20"/>
-          <w:szCs w:val="20"/>
-        </w:rPr>
-        <w:t xml:space="preserve"> Instead of the client making those separate calls we can have a service aggregator component in one place that can make all those calls .For example Rate </w:t>
-      </w:r>
-      <w:proofErr w:type="spellStart"/>
-      <w:r>
-        <w:rPr>
-          <w:sz w:val="20"/>
-          <w:szCs w:val="20"/>
-        </w:rPr>
-        <w:t>Limits.If</w:t>
-      </w:r>
-      <w:proofErr w:type="spellEnd"/>
-      <w:r>
-        <w:rPr>
-          <w:sz w:val="20"/>
-          <w:szCs w:val="20"/>
-        </w:rPr>
-        <w:t xml:space="preserve"> you want to charge your client based on the request like Amazon or Microsoft azure cloud you can apply all those rate </w:t>
-      </w:r>
-      <w:proofErr w:type="spellStart"/>
-      <w:r>
-        <w:rPr>
-          <w:sz w:val="20"/>
-          <w:szCs w:val="20"/>
-        </w:rPr>
-        <w:t>limits.If</w:t>
-      </w:r>
-      <w:proofErr w:type="spellEnd"/>
-      <w:r>
-        <w:rPr>
-          <w:sz w:val="20"/>
-          <w:szCs w:val="20"/>
-        </w:rPr>
-        <w:t xml:space="preserve"> we have a centralized place so all these non-functional requirements that are common across microservices can go into each micro service which will repeat the same code the same components across microservices are we can put these cross cutting concerns in one place and that is where the </w:t>
-      </w:r>
-      <w:proofErr w:type="spellStart"/>
-      <w:r>
-        <w:rPr>
-          <w:sz w:val="20"/>
-          <w:szCs w:val="20"/>
-        </w:rPr>
-        <w:t>Zuul</w:t>
-      </w:r>
-      <w:proofErr w:type="spellEnd"/>
-      <w:r>
-        <w:rPr>
-          <w:sz w:val="20"/>
-          <w:szCs w:val="20"/>
-        </w:rPr>
-        <w:t xml:space="preserve"> proxy component of spring cloud comes in.</w:t>
-      </w:r>
-    </w:p>
-    <w:p>
-      <w:pPr>
-        <w:tabs>
-          <w:tab w:val="left" w:pos="1172"/>
-        </w:tabs>
-        <w:spacing w:after="0"/>
-        <w:rPr>
-          <w:sz w:val="20"/>
-          <w:szCs w:val="20"/>
-        </w:rPr>
-      </w:pPr>
-    </w:p>
-    <w:p>
-      <w:pPr>
-        <w:tabs>
-          <w:tab w:val="left" w:pos="1172"/>
-        </w:tabs>
-        <w:spacing w:after="0"/>
-        <w:rPr>
-          <w:sz w:val="20"/>
-          <w:szCs w:val="20"/>
-        </w:rPr>
-      </w:pPr>
-      <w:r>
-        <w:rPr>
-          <w:noProof/>
-          <w:sz w:val="20"/>
-          <w:szCs w:val="20"/>
-        </w:rPr>
-        <w:lastRenderedPageBreak/>
-        <w:drawing>
-          <wp:inline distT="0" distB="0" distL="0" distR="0" wp14:anchorId="6509594E" wp14:editId="076B5EE1">
-            <wp:extent cx="6096000" cy="3429000"/>
-            <wp:effectExtent l="0" t="0" r="0" b="0"/>
-            <wp:docPr id="384072070" name="Picture 9"/>
-            <wp:cNvGraphicFramePr>
-              <a:graphicFrameLocks xmlns:a="http://schemas.openxmlformats.org/drawingml/2006/main" noChangeAspect="1"/>
-            </wp:cNvGraphicFramePr>
-            <a:graphic xmlns:a="http://schemas.openxmlformats.org/drawingml/2006/main">
-              <a:graphicData uri="http://schemas.openxmlformats.org/drawingml/2006/picture">
-                <pic:pic xmlns:pic="http://schemas.openxmlformats.org/drawingml/2006/picture">
-                  <pic:nvPicPr>
-                    <pic:cNvPr id="0" name="Picture 34"/>
-                    <pic:cNvPicPr>
-                      <a:picLocks noChangeAspect="1" noChangeArrowheads="1"/>
-                    </pic:cNvPicPr>
-                  </pic:nvPicPr>
-                  <pic:blipFill>
-                    <a:blip r:embed="rId25" cstate="print">
-                      <a:extLst>
-                        <a:ext uri="{28A0092B-C50C-407E-A947-70E740481C1C}">
-                          <a14:useLocalDpi xmlns:a14="http://schemas.microsoft.com/office/drawing/2010/main" val="0"/>
-                        </a:ext>
-                      </a:extLst>
-                    </a:blip>
-                    <a:srcRect/>
-                    <a:stretch>
-                      <a:fillRect/>
-                    </a:stretch>
-                  </pic:blipFill>
-                  <pic:spPr bwMode="auto">
-                    <a:xfrm>
-                      <a:off x="0" y="0"/>
-                      <a:ext cx="6096000" cy="3429000"/>
-                    </a:xfrm>
-                    <a:prstGeom prst="rect">
-                      <a:avLst/>
-                    </a:prstGeom>
-                    <a:noFill/>
-                    <a:ln>
-                      <a:noFill/>
-                    </a:ln>
-                  </pic:spPr>
-                </pic:pic>
-              </a:graphicData>
-            </a:graphic>
-          </wp:inline>
-        </w:drawing>
-      </w:r>
-    </w:p>
-    <w:p>
-      <w:pPr>
-        <w:tabs>
-          <w:tab w:val="left" w:pos="1172"/>
-        </w:tabs>
-        <w:spacing w:after="0"/>
-        <w:rPr>
-          <w:sz w:val="20"/>
-          <w:szCs w:val="20"/>
-        </w:rPr>
-      </w:pPr>
-    </w:p>
-    <w:p>
-      <w:pPr>
-        <w:tabs>
-          <w:tab w:val="left" w:pos="1172"/>
-        </w:tabs>
-        <w:spacing w:after="0"/>
-        <w:rPr>
-          <w:sz w:val="20"/>
-          <w:szCs w:val="20"/>
-        </w:rPr>
-      </w:pPr>
-      <w:r>
-        <w:rPr>
-          <w:sz w:val="20"/>
-          <w:szCs w:val="20"/>
-        </w:rPr>
-        <w:t xml:space="preserve">Once we create a </w:t>
-      </w:r>
-      <w:proofErr w:type="spellStart"/>
-      <w:r>
-        <w:rPr>
-          <w:sz w:val="20"/>
-          <w:szCs w:val="20"/>
-        </w:rPr>
-        <w:t>Zuul</w:t>
-      </w:r>
-      <w:proofErr w:type="spellEnd"/>
-      <w:r>
-        <w:rPr>
-          <w:sz w:val="20"/>
-          <w:szCs w:val="20"/>
-        </w:rPr>
-        <w:t xml:space="preserve"> proxy server all the requests will route through the </w:t>
-      </w:r>
-      <w:proofErr w:type="spellStart"/>
-      <w:r>
-        <w:rPr>
-          <w:sz w:val="20"/>
-          <w:szCs w:val="20"/>
-        </w:rPr>
-        <w:t>Zuul</w:t>
-      </w:r>
-      <w:proofErr w:type="spellEnd"/>
-      <w:r>
-        <w:rPr>
-          <w:sz w:val="20"/>
-          <w:szCs w:val="20"/>
-        </w:rPr>
-        <w:t xml:space="preserve"> proxy gateway the client requests will go through the </w:t>
-      </w:r>
-      <w:proofErr w:type="spellStart"/>
-      <w:r>
-        <w:rPr>
-          <w:sz w:val="20"/>
-          <w:szCs w:val="20"/>
-        </w:rPr>
-        <w:t>Zuul</w:t>
-      </w:r>
-      <w:proofErr w:type="spellEnd"/>
-      <w:r>
-        <w:rPr>
-          <w:sz w:val="20"/>
-          <w:szCs w:val="20"/>
-        </w:rPr>
-        <w:t xml:space="preserve"> </w:t>
-      </w:r>
-      <w:proofErr w:type="gramStart"/>
-      <w:r>
-        <w:rPr>
-          <w:sz w:val="20"/>
-          <w:szCs w:val="20"/>
-        </w:rPr>
-        <w:t>proxy .We</w:t>
-      </w:r>
-      <w:proofErr w:type="gramEnd"/>
-      <w:r>
-        <w:rPr>
-          <w:sz w:val="20"/>
-          <w:szCs w:val="20"/>
-        </w:rPr>
-        <w:t xml:space="preserve"> can implement Security, </w:t>
-      </w:r>
-      <w:proofErr w:type="gramStart"/>
-      <w:r>
-        <w:rPr>
-          <w:sz w:val="20"/>
-          <w:szCs w:val="20"/>
-        </w:rPr>
-        <w:t>Tracing ,</w:t>
-      </w:r>
-      <w:proofErr w:type="gramEnd"/>
-      <w:r>
-        <w:rPr>
-          <w:sz w:val="20"/>
-          <w:szCs w:val="20"/>
-        </w:rPr>
-        <w:t xml:space="preserve"> Service aggregation and all that inside the </w:t>
-      </w:r>
-      <w:proofErr w:type="spellStart"/>
-      <w:r>
-        <w:rPr>
-          <w:sz w:val="20"/>
-          <w:szCs w:val="20"/>
-        </w:rPr>
-        <w:t>Zuul</w:t>
-      </w:r>
-      <w:proofErr w:type="spellEnd"/>
-      <w:r>
-        <w:rPr>
-          <w:sz w:val="20"/>
-          <w:szCs w:val="20"/>
-        </w:rPr>
-        <w:t xml:space="preserve"> </w:t>
-      </w:r>
-      <w:proofErr w:type="gramStart"/>
-      <w:r>
-        <w:rPr>
-          <w:sz w:val="20"/>
-          <w:szCs w:val="20"/>
-        </w:rPr>
-        <w:t>proxy .</w:t>
-      </w:r>
-      <w:proofErr w:type="gramEnd"/>
-    </w:p>
-    <w:p>
-      <w:pPr>
-        <w:tabs>
-          <w:tab w:val="left" w:pos="1172"/>
-        </w:tabs>
-        <w:spacing w:after="0"/>
-        <w:rPr>
-          <w:sz w:val="20"/>
-          <w:szCs w:val="20"/>
-        </w:rPr>
-      </w:pPr>
-      <w:r>
-        <w:rPr>
-          <w:sz w:val="20"/>
-          <w:szCs w:val="20"/>
-        </w:rPr>
-        <w:t xml:space="preserve">We create a </w:t>
-      </w:r>
-      <w:proofErr w:type="spellStart"/>
-      <w:r>
-        <w:rPr>
-          <w:sz w:val="20"/>
-          <w:szCs w:val="20"/>
-        </w:rPr>
-        <w:t>Zuul</w:t>
-      </w:r>
-      <w:proofErr w:type="spellEnd"/>
-      <w:r>
-        <w:rPr>
-          <w:sz w:val="20"/>
-          <w:szCs w:val="20"/>
-        </w:rPr>
-        <w:t xml:space="preserve"> proxy server just like Eureka </w:t>
-      </w:r>
-      <w:proofErr w:type="gramStart"/>
-      <w:r>
-        <w:rPr>
-          <w:sz w:val="20"/>
-          <w:szCs w:val="20"/>
-        </w:rPr>
-        <w:t>Server .</w:t>
-      </w:r>
-      <w:proofErr w:type="gramEnd"/>
-      <w:r>
-        <w:rPr>
-          <w:sz w:val="20"/>
-          <w:szCs w:val="20"/>
-        </w:rPr>
-        <w:t xml:space="preserve"> Add Netflix </w:t>
-      </w:r>
-      <w:proofErr w:type="spellStart"/>
-      <w:r>
-        <w:rPr>
-          <w:sz w:val="20"/>
-          <w:szCs w:val="20"/>
-        </w:rPr>
-        <w:t>Zuul</w:t>
-      </w:r>
-      <w:proofErr w:type="spellEnd"/>
-      <w:r>
-        <w:rPr>
-          <w:sz w:val="20"/>
-          <w:szCs w:val="20"/>
-        </w:rPr>
-        <w:t xml:space="preserve"> dependency and then it will register itself with </w:t>
-      </w:r>
-      <w:proofErr w:type="gramStart"/>
-      <w:r>
-        <w:rPr>
-          <w:sz w:val="20"/>
-          <w:szCs w:val="20"/>
-        </w:rPr>
-        <w:t>Eureka .</w:t>
-      </w:r>
-      <w:proofErr w:type="gramEnd"/>
-      <w:r>
-        <w:rPr>
-          <w:sz w:val="20"/>
-          <w:szCs w:val="20"/>
-        </w:rPr>
-        <w:t xml:space="preserve"> </w:t>
-      </w:r>
-      <w:proofErr w:type="spellStart"/>
-      <w:r>
-        <w:rPr>
-          <w:sz w:val="20"/>
-          <w:szCs w:val="20"/>
-        </w:rPr>
-        <w:t>Zuul</w:t>
-      </w:r>
-      <w:proofErr w:type="spellEnd"/>
-      <w:r>
-        <w:rPr>
-          <w:sz w:val="20"/>
-          <w:szCs w:val="20"/>
-        </w:rPr>
-        <w:t xml:space="preserve"> will be just like any other micro service; it will register itself with Eureka when it starts and other microservices can start using it.</w:t>
-      </w:r>
-    </w:p>
-    <w:p>
-      <w:pPr>
-        <w:tabs>
-          <w:tab w:val="left" w:pos="1172"/>
-        </w:tabs>
-        <w:spacing w:after="0"/>
-        <w:rPr>
-          <w:sz w:val="20"/>
-          <w:szCs w:val="20"/>
-        </w:rPr>
-      </w:pPr>
-      <w:r>
-        <w:rPr>
-          <w:sz w:val="20"/>
-          <w:szCs w:val="20"/>
-        </w:rPr>
-        <w:t>5) What is Hystrix</w:t>
-      </w:r>
-    </w:p>
-    <w:p>
-      <w:pPr>
-        <w:tabs>
-          <w:tab w:val="left" w:pos="1172"/>
-        </w:tabs>
-        <w:spacing w:after="0"/>
-        <w:rPr>
-          <w:sz w:val="20"/>
-          <w:szCs w:val="20"/>
-        </w:rPr>
-      </w:pPr>
-      <w:r>
-        <w:rPr>
-          <w:sz w:val="20"/>
-          <w:szCs w:val="20"/>
-        </w:rPr>
-        <w:t xml:space="preserve">When we implement micro </w:t>
-      </w:r>
-      <w:proofErr w:type="gramStart"/>
-      <w:r>
-        <w:rPr>
-          <w:sz w:val="20"/>
-          <w:szCs w:val="20"/>
-        </w:rPr>
-        <w:t>services architecture</w:t>
-      </w:r>
-      <w:proofErr w:type="gramEnd"/>
-      <w:r>
-        <w:rPr>
-          <w:sz w:val="20"/>
-          <w:szCs w:val="20"/>
-        </w:rPr>
-        <w:t xml:space="preserve"> there will be a lot of microservices </w:t>
-      </w:r>
-      <w:proofErr w:type="spellStart"/>
-      <w:proofErr w:type="gramStart"/>
-      <w:r>
-        <w:rPr>
-          <w:sz w:val="20"/>
-          <w:szCs w:val="20"/>
-        </w:rPr>
-        <w:t>running.And</w:t>
-      </w:r>
-      <w:proofErr w:type="spellEnd"/>
-      <w:proofErr w:type="gramEnd"/>
-      <w:r>
-        <w:rPr>
-          <w:sz w:val="20"/>
-          <w:szCs w:val="20"/>
-        </w:rPr>
-        <w:t xml:space="preserve"> if one of these micro services goes down for some reason the entire system should not </w:t>
-      </w:r>
-      <w:proofErr w:type="spellStart"/>
-      <w:proofErr w:type="gramStart"/>
-      <w:r>
-        <w:rPr>
-          <w:sz w:val="20"/>
-          <w:szCs w:val="20"/>
-        </w:rPr>
-        <w:t>collapse.The</w:t>
-      </w:r>
-      <w:proofErr w:type="spellEnd"/>
-      <w:proofErr w:type="gramEnd"/>
-      <w:r>
-        <w:rPr>
-          <w:sz w:val="20"/>
-          <w:szCs w:val="20"/>
-        </w:rPr>
-        <w:t xml:space="preserve"> errors should be handled gracefully and the minimum functionality should be delivered to the end </w:t>
-      </w:r>
-      <w:proofErr w:type="spellStart"/>
-      <w:proofErr w:type="gramStart"/>
-      <w:r>
-        <w:rPr>
-          <w:sz w:val="20"/>
-          <w:szCs w:val="20"/>
-        </w:rPr>
-        <w:t>user.That</w:t>
-      </w:r>
-      <w:proofErr w:type="spellEnd"/>
-      <w:proofErr w:type="gramEnd"/>
-      <w:r>
-        <w:rPr>
-          <w:sz w:val="20"/>
-          <w:szCs w:val="20"/>
-        </w:rPr>
-        <w:t xml:space="preserve"> is where this spring cloud hystrix component comes in and it provides fault tolerance capabilities.</w:t>
-      </w:r>
-    </w:p>
-    <w:p>
-      <w:pPr>
-        <w:tabs>
-          <w:tab w:val="left" w:pos="1172"/>
-        </w:tabs>
-        <w:spacing w:after="0"/>
-        <w:rPr>
-          <w:sz w:val="20"/>
-          <w:szCs w:val="20"/>
-        </w:rPr>
-      </w:pPr>
-    </w:p>
-    <w:p>
-      <w:pPr>
-        <w:tabs>
-          <w:tab w:val="left" w:pos="1172"/>
-        </w:tabs>
-        <w:spacing w:after="0"/>
-        <w:rPr>
-          <w:sz w:val="20"/>
-          <w:szCs w:val="20"/>
-        </w:rPr>
-      </w:pPr>
-      <w:r>
-        <w:rPr>
-          <w:noProof/>
-          <w:sz w:val="20"/>
-          <w:szCs w:val="20"/>
-        </w:rPr>
-        <w:drawing>
-          <wp:inline distT="0" distB="0" distL="0" distR="0" wp14:anchorId="32B3ED90" wp14:editId="7736ABD7">
-            <wp:extent cx="5364480" cy="3017520"/>
-            <wp:effectExtent l="0" t="0" r="7620" b="0"/>
-            <wp:docPr id="792952572" name="Picture 8"/>
-            <wp:cNvGraphicFramePr>
-              <a:graphicFrameLocks xmlns:a="http://schemas.openxmlformats.org/drawingml/2006/main" noChangeAspect="1"/>
-            </wp:cNvGraphicFramePr>
-            <a:graphic xmlns:a="http://schemas.openxmlformats.org/drawingml/2006/main">
-              <a:graphicData uri="http://schemas.openxmlformats.org/drawingml/2006/picture">
-                <pic:pic xmlns:pic="http://schemas.openxmlformats.org/drawingml/2006/picture">
-                  <pic:nvPicPr>
-                    <pic:cNvPr id="0" name="Picture 35"/>
-                    <pic:cNvPicPr>
-                      <a:picLocks noChangeAspect="1" noChangeArrowheads="1"/>
-                    </pic:cNvPicPr>
-                  </pic:nvPicPr>
-                  <pic:blipFill>
-                    <a:blip r:embed="rId26" cstate="print">
-                      <a:extLst>
-                        <a:ext uri="{28A0092B-C50C-407E-A947-70E740481C1C}">
-                          <a14:useLocalDpi xmlns:a14="http://schemas.microsoft.com/office/drawing/2010/main" val="0"/>
-                        </a:ext>
-                      </a:extLst>
-                    </a:blip>
-                    <a:srcRect/>
-                    <a:stretch>
-                      <a:fillRect/>
-                    </a:stretch>
-                  </pic:blipFill>
-                  <pic:spPr bwMode="auto">
-                    <a:xfrm>
-                      <a:off x="0" y="0"/>
-                      <a:ext cx="5364480" cy="3017520"/>
-                    </a:xfrm>
-                    <a:prstGeom prst="rect">
-                      <a:avLst/>
-                    </a:prstGeom>
-                    <a:noFill/>
-                    <a:ln>
-                      <a:noFill/>
-                    </a:ln>
-                  </pic:spPr>
-                </pic:pic>
-              </a:graphicData>
-            </a:graphic>
-          </wp:inline>
-        </w:drawing>
-      </w:r>
-    </w:p>
-    <w:p>
-      <w:pPr>
-        <w:tabs>
-          <w:tab w:val="left" w:pos="1172"/>
-        </w:tabs>
-        <w:spacing w:after="0"/>
-        <w:rPr>
-          <w:sz w:val="20"/>
-          <w:szCs w:val="20"/>
-        </w:rPr>
-      </w:pPr>
-    </w:p>
-    <w:p>
-      <w:pPr>
-        <w:tabs>
-          <w:tab w:val="left" w:pos="1172"/>
-        </w:tabs>
-        <w:spacing w:after="0"/>
-        <w:rPr>
-          <w:sz w:val="20"/>
-          <w:szCs w:val="20"/>
-        </w:rPr>
-      </w:pPr>
-      <w:r>
-        <w:rPr>
-          <w:sz w:val="20"/>
-          <w:szCs w:val="20"/>
-        </w:rPr>
-        <w:t>Steps to use Hystrix:</w:t>
-      </w:r>
-    </w:p>
-    <w:p>
-      <w:pPr>
-        <w:tabs>
-          <w:tab w:val="left" w:pos="1172"/>
-        </w:tabs>
-        <w:spacing w:after="0"/>
-        <w:rPr>
-          <w:sz w:val="20"/>
-          <w:szCs w:val="20"/>
-        </w:rPr>
-      </w:pPr>
-      <w:r>
-        <w:rPr>
-          <w:sz w:val="20"/>
-          <w:szCs w:val="20"/>
-        </w:rPr>
-        <w:t>Add Hystrix dependency to the project</w:t>
-      </w:r>
-    </w:p>
-    <w:p>
-      <w:pPr>
-        <w:tabs>
-          <w:tab w:val="left" w:pos="1172"/>
-        </w:tabs>
-        <w:spacing w:after="0"/>
-        <w:rPr>
-          <w:sz w:val="20"/>
-          <w:szCs w:val="20"/>
-        </w:rPr>
-      </w:pPr>
-      <w:r>
-        <w:rPr>
-          <w:sz w:val="20"/>
-          <w:szCs w:val="20"/>
-        </w:rPr>
-        <w:t>&lt;dependency&gt;</w:t>
-      </w:r>
-    </w:p>
-    <w:p>
-      <w:pPr>
-        <w:tabs>
-          <w:tab w:val="left" w:pos="1172"/>
-        </w:tabs>
-        <w:spacing w:after="0"/>
-        <w:rPr>
-          <w:sz w:val="20"/>
-          <w:szCs w:val="20"/>
-        </w:rPr>
-      </w:pPr>
-      <w:proofErr w:type="gramStart"/>
-      <w:r>
-        <w:rPr>
-          <w:sz w:val="20"/>
-          <w:szCs w:val="20"/>
-        </w:rPr>
-        <w:t>&lt;</w:t>
-      </w:r>
-      <w:proofErr w:type="spellStart"/>
-      <w:r>
-        <w:rPr>
-          <w:sz w:val="20"/>
-          <w:szCs w:val="20"/>
-        </w:rPr>
-        <w:t>groupId</w:t>
-      </w:r>
-      <w:proofErr w:type="spellEnd"/>
-      <w:r>
-        <w:rPr>
-          <w:sz w:val="20"/>
-          <w:szCs w:val="20"/>
-        </w:rPr>
-        <w:t>&gt;</w:t>
-      </w:r>
-      <w:proofErr w:type="spellStart"/>
-      <w:r>
-        <w:rPr>
-          <w:sz w:val="20"/>
-          <w:szCs w:val="20"/>
-        </w:rPr>
-        <w:t>org.springframework.cloud</w:t>
-      </w:r>
-      <w:proofErr w:type="spellEnd"/>
-      <w:proofErr w:type="gramEnd"/>
-      <w:r>
-        <w:rPr>
-          <w:sz w:val="20"/>
-          <w:szCs w:val="20"/>
-        </w:rPr>
-        <w:t>&lt;/</w:t>
-      </w:r>
-      <w:proofErr w:type="spellStart"/>
-      <w:r>
-        <w:rPr>
-          <w:sz w:val="20"/>
-          <w:szCs w:val="20"/>
-        </w:rPr>
-        <w:t>groupId</w:t>
-      </w:r>
-      <w:proofErr w:type="spellEnd"/>
-      <w:r>
-        <w:rPr>
-          <w:sz w:val="20"/>
-          <w:szCs w:val="20"/>
-        </w:rPr>
-        <w:t>&gt;</w:t>
-      </w:r>
-    </w:p>
-    <w:p>
-      <w:pPr>
-        <w:tabs>
-          <w:tab w:val="left" w:pos="1172"/>
-        </w:tabs>
-        <w:spacing w:after="0"/>
-        <w:rPr>
-          <w:sz w:val="20"/>
-          <w:szCs w:val="20"/>
-        </w:rPr>
-      </w:pPr>
-      <w:r>
-        <w:rPr>
-          <w:sz w:val="20"/>
-          <w:szCs w:val="20"/>
-        </w:rPr>
-        <w:t>&lt;</w:t>
-      </w:r>
-      <w:proofErr w:type="spellStart"/>
-      <w:r>
-        <w:rPr>
-          <w:sz w:val="20"/>
-          <w:szCs w:val="20"/>
-        </w:rPr>
-        <w:t>artifactId</w:t>
-      </w:r>
-      <w:proofErr w:type="spellEnd"/>
-      <w:r>
-        <w:rPr>
-          <w:sz w:val="20"/>
-          <w:szCs w:val="20"/>
-        </w:rPr>
-        <w:t>&gt;spring-cloud-starter-</w:t>
-      </w:r>
-      <w:proofErr w:type="spellStart"/>
-      <w:r>
-        <w:rPr>
-          <w:sz w:val="20"/>
-          <w:szCs w:val="20"/>
-        </w:rPr>
-        <w:t>netflix</w:t>
-      </w:r>
-      <w:proofErr w:type="spellEnd"/>
-      <w:r>
-        <w:rPr>
-          <w:sz w:val="20"/>
-          <w:szCs w:val="20"/>
-        </w:rPr>
-        <w:t>-hystrix&lt;/</w:t>
-      </w:r>
-      <w:proofErr w:type="spellStart"/>
-      <w:r>
-        <w:rPr>
-          <w:sz w:val="20"/>
-          <w:szCs w:val="20"/>
-        </w:rPr>
-        <w:t>artifactId</w:t>
-      </w:r>
-      <w:proofErr w:type="spellEnd"/>
-      <w:r>
-        <w:rPr>
-          <w:sz w:val="20"/>
-          <w:szCs w:val="20"/>
-        </w:rPr>
-        <w:t>&gt;</w:t>
-      </w:r>
-    </w:p>
-    <w:p>
-      <w:pPr>
-        <w:tabs>
-          <w:tab w:val="left" w:pos="1172"/>
-        </w:tabs>
-        <w:spacing w:after="0"/>
-        <w:rPr>
-          <w:sz w:val="20"/>
-          <w:szCs w:val="20"/>
-        </w:rPr>
-      </w:pPr>
-      <w:r>
-        <w:rPr>
-          <w:sz w:val="20"/>
-          <w:szCs w:val="20"/>
-        </w:rPr>
-        <w:t>&lt;/dependency&gt;</w:t>
-      </w:r>
-    </w:p>
-    <w:p>
-      <w:pPr>
-        <w:tabs>
-          <w:tab w:val="left" w:pos="1172"/>
-        </w:tabs>
-        <w:spacing w:after="0"/>
-        <w:rPr>
-          <w:sz w:val="20"/>
-          <w:szCs w:val="20"/>
-        </w:rPr>
-      </w:pPr>
-    </w:p>
-    <w:p>
-      <w:pPr>
-        <w:tabs>
-          <w:tab w:val="left" w:pos="1172"/>
-        </w:tabs>
-        <w:spacing w:after="0"/>
-        <w:rPr>
-          <w:sz w:val="20"/>
-          <w:szCs w:val="20"/>
-        </w:rPr>
-      </w:pPr>
-      <w:r>
-        <w:rPr>
-          <w:sz w:val="20"/>
-          <w:szCs w:val="20"/>
-        </w:rPr>
-        <w:t>Second Step enable hystrix by using the following on application class</w:t>
-      </w:r>
-    </w:p>
-    <w:p>
-      <w:pPr>
-        <w:tabs>
-          <w:tab w:val="left" w:pos="1172"/>
-        </w:tabs>
-        <w:spacing w:after="0"/>
-        <w:rPr>
-          <w:sz w:val="20"/>
-          <w:szCs w:val="20"/>
-        </w:rPr>
-      </w:pPr>
-    </w:p>
-    <w:p>
-      <w:pPr>
-        <w:tabs>
-          <w:tab w:val="left" w:pos="1172"/>
-        </w:tabs>
-        <w:spacing w:after="0"/>
-        <w:rPr>
-          <w:sz w:val="20"/>
-          <w:szCs w:val="20"/>
-        </w:rPr>
-      </w:pPr>
-      <w:r>
-        <w:rPr>
-          <w:sz w:val="20"/>
-          <w:szCs w:val="20"/>
-        </w:rPr>
-        <w:t>@EnableHystrix</w:t>
-      </w:r>
-    </w:p>
-    <w:p>
-      <w:pPr>
-        <w:tabs>
-          <w:tab w:val="left" w:pos="1172"/>
-        </w:tabs>
-        <w:spacing w:after="0"/>
-        <w:rPr>
-          <w:sz w:val="20"/>
-          <w:szCs w:val="20"/>
-        </w:rPr>
-      </w:pPr>
-    </w:p>
-    <w:p>
-      <w:pPr>
-        <w:tabs>
-          <w:tab w:val="left" w:pos="1172"/>
-        </w:tabs>
-        <w:spacing w:after="0"/>
-        <w:rPr>
-          <w:sz w:val="20"/>
-          <w:szCs w:val="20"/>
-        </w:rPr>
-      </w:pPr>
-      <w:r>
-        <w:rPr>
-          <w:sz w:val="20"/>
-          <w:szCs w:val="20"/>
-        </w:rPr>
-        <w:t>Create a Fault tolerant method in the REST controllers</w:t>
-      </w:r>
-    </w:p>
-    <w:p>
-      <w:pPr>
-        <w:tabs>
-          <w:tab w:val="left" w:pos="1172"/>
-        </w:tabs>
-        <w:spacing w:after="0"/>
-        <w:rPr>
-          <w:sz w:val="20"/>
-          <w:szCs w:val="20"/>
-        </w:rPr>
-      </w:pPr>
-    </w:p>
-    <w:p>
-      <w:pPr>
-        <w:tabs>
-          <w:tab w:val="left" w:pos="1172"/>
-        </w:tabs>
-        <w:spacing w:after="0"/>
-        <w:rPr>
-          <w:sz w:val="20"/>
-          <w:szCs w:val="20"/>
-        </w:rPr>
-      </w:pPr>
-      <w:r>
-        <w:rPr>
-          <w:sz w:val="20"/>
-          <w:szCs w:val="20"/>
-        </w:rPr>
-        <w:lastRenderedPageBreak/>
-        <w:t>public Product </w:t>
-      </w:r>
-      <w:proofErr w:type="spellStart"/>
-      <w:proofErr w:type="gramStart"/>
-      <w:r>
-        <w:rPr>
-          <w:sz w:val="20"/>
-          <w:szCs w:val="20"/>
-        </w:rPr>
-        <w:t>sendErrorResponse</w:t>
-      </w:r>
-      <w:proofErr w:type="spellEnd"/>
-      <w:r>
-        <w:rPr>
-          <w:sz w:val="20"/>
-          <w:szCs w:val="20"/>
-        </w:rPr>
-        <w:t>(</w:t>
-      </w:r>
-      <w:proofErr w:type="gramEnd"/>
-      <w:r>
-        <w:rPr>
-          <w:sz w:val="20"/>
-          <w:szCs w:val="20"/>
-        </w:rPr>
-        <w:t>Product product) {</w:t>
-      </w:r>
-    </w:p>
-    <w:p>
-      <w:pPr>
-        <w:tabs>
-          <w:tab w:val="left" w:pos="1172"/>
-        </w:tabs>
-        <w:spacing w:after="0"/>
-        <w:rPr>
-          <w:sz w:val="20"/>
-          <w:szCs w:val="20"/>
-        </w:rPr>
-      </w:pPr>
-      <w:r>
-        <w:rPr>
-          <w:sz w:val="20"/>
-          <w:szCs w:val="20"/>
-        </w:rPr>
-        <w:t>…….</w:t>
-      </w:r>
-    </w:p>
-    <w:p>
-      <w:pPr>
-        <w:tabs>
-          <w:tab w:val="left" w:pos="1172"/>
-        </w:tabs>
-        <w:spacing w:after="0"/>
-        <w:rPr>
-          <w:sz w:val="20"/>
-          <w:szCs w:val="20"/>
-        </w:rPr>
-      </w:pPr>
-      <w:r>
-        <w:rPr>
-          <w:sz w:val="20"/>
-          <w:szCs w:val="20"/>
-        </w:rPr>
-        <w:t>And use it on a method where the fault might occur</w:t>
-      </w:r>
-    </w:p>
-    <w:p>
-      <w:pPr>
-        <w:tabs>
-          <w:tab w:val="left" w:pos="1172"/>
-        </w:tabs>
-        <w:spacing w:after="0"/>
-        <w:rPr>
-          <w:sz w:val="20"/>
-          <w:szCs w:val="20"/>
-        </w:rPr>
-      </w:pPr>
-    </w:p>
-    <w:p>
-      <w:pPr>
-        <w:tabs>
-          <w:tab w:val="left" w:pos="1172"/>
-        </w:tabs>
-        <w:spacing w:after="0"/>
-        <w:rPr>
-          <w:sz w:val="20"/>
-          <w:szCs w:val="20"/>
-        </w:rPr>
-      </w:pPr>
-      <w:r>
-        <w:rPr>
-          <w:sz w:val="20"/>
-          <w:szCs w:val="20"/>
-        </w:rPr>
-        <w:t>@</w:t>
-      </w:r>
-      <w:proofErr w:type="gramStart"/>
-      <w:r>
-        <w:rPr>
-          <w:sz w:val="20"/>
-          <w:szCs w:val="20"/>
-        </w:rPr>
-        <w:t>HystrixCommand(</w:t>
-      </w:r>
-      <w:proofErr w:type="gramEnd"/>
-      <w:r>
-        <w:rPr>
-          <w:sz w:val="20"/>
-          <w:szCs w:val="20"/>
-        </w:rPr>
-        <w:t>fallbackMethod = "</w:t>
-      </w:r>
-      <w:proofErr w:type="spellStart"/>
-      <w:r>
-        <w:rPr>
-          <w:sz w:val="20"/>
-          <w:szCs w:val="20"/>
-        </w:rPr>
-        <w:t>sendErrorResponse</w:t>
-      </w:r>
-      <w:proofErr w:type="spellEnd"/>
-      <w:r>
-        <w:rPr>
-          <w:sz w:val="20"/>
-          <w:szCs w:val="20"/>
-        </w:rPr>
-        <w:t>")</w:t>
-      </w:r>
-    </w:p>
-    <w:p>
-      <w:pPr>
-        <w:tabs>
-          <w:tab w:val="left" w:pos="1172"/>
-        </w:tabs>
-        <w:spacing w:after="0"/>
-        <w:rPr>
-          <w:sz w:val="20"/>
-          <w:szCs w:val="20"/>
-        </w:rPr>
-      </w:pPr>
-      <w:r>
-        <w:rPr>
-          <w:sz w:val="20"/>
-          <w:szCs w:val="20"/>
-        </w:rPr>
-        <w:t>@</w:t>
-      </w:r>
-      <w:proofErr w:type="gramStart"/>
-      <w:r>
-        <w:rPr>
-          <w:sz w:val="20"/>
-          <w:szCs w:val="20"/>
-        </w:rPr>
-        <w:t>RequestMapping(</w:t>
-      </w:r>
-      <w:proofErr w:type="gramEnd"/>
-      <w:r>
-        <w:rPr>
-          <w:sz w:val="20"/>
-          <w:szCs w:val="20"/>
-        </w:rPr>
-        <w:t xml:space="preserve">value = "/products", method = </w:t>
-      </w:r>
-      <w:proofErr w:type="spellStart"/>
-      <w:r>
-        <w:rPr>
-          <w:sz w:val="20"/>
-          <w:szCs w:val="20"/>
-        </w:rPr>
-        <w:t>RequestMethod.POST</w:t>
-      </w:r>
-      <w:proofErr w:type="spellEnd"/>
-      <w:r>
-        <w:rPr>
-          <w:sz w:val="20"/>
-          <w:szCs w:val="20"/>
-        </w:rPr>
-        <w:t>)</w:t>
-      </w:r>
-    </w:p>
-    <w:p>
-      <w:pPr>
-        <w:tabs>
-          <w:tab w:val="left" w:pos="1172"/>
-        </w:tabs>
-        <w:spacing w:after="0"/>
-        <w:rPr>
-          <w:sz w:val="20"/>
-          <w:szCs w:val="20"/>
-        </w:rPr>
-      </w:pPr>
-      <w:r>
-        <w:rPr>
-          <w:sz w:val="20"/>
-          <w:szCs w:val="20"/>
-        </w:rPr>
-        <w:t xml:space="preserve">public Product </w:t>
-      </w:r>
-      <w:proofErr w:type="gramStart"/>
-      <w:r>
-        <w:rPr>
-          <w:sz w:val="20"/>
-          <w:szCs w:val="20"/>
-        </w:rPr>
-        <w:t>create(</w:t>
-      </w:r>
-      <w:proofErr w:type="gramEnd"/>
-      <w:r>
-        <w:rPr>
-          <w:sz w:val="20"/>
-          <w:szCs w:val="20"/>
-        </w:rPr>
-        <w:t>@RequestBody Product product)</w:t>
-      </w:r>
-    </w:p>
-    <w:p>
-      <w:pPr>
-        <w:tabs>
-          <w:tab w:val="left" w:pos="1172"/>
-        </w:tabs>
-        <w:spacing w:after="0"/>
-        <w:rPr>
-          <w:sz w:val="20"/>
-          <w:szCs w:val="20"/>
-        </w:rPr>
-      </w:pPr>
-    </w:p>
-    <w:p>
-      <w:pPr>
-        <w:tabs>
-          <w:tab w:val="left" w:pos="1172"/>
-        </w:tabs>
-        <w:spacing w:after="0"/>
-        <w:rPr>
-          <w:sz w:val="20"/>
-          <w:szCs w:val="20"/>
-        </w:rPr>
-      </w:pPr>
-    </w:p>
-    <w:p>
-      <w:pPr>
-        <w:tabs>
-          <w:tab w:val="left" w:pos="1172"/>
-        </w:tabs>
-        <w:spacing w:after="0"/>
-        <w:rPr>
-          <w:sz w:val="20"/>
-          <w:szCs w:val="20"/>
-        </w:rPr>
-      </w:pPr>
-      <w:r>
-        <w:rPr>
-          <w:sz w:val="20"/>
-          <w:szCs w:val="20"/>
-        </w:rPr>
-        <w:t xml:space="preserve">When something goes wrong inside of this method this is the fault tolerant method that will be invoked by Hystrix and whatever response this method returns that will be sent back to the </w:t>
-      </w:r>
-      <w:proofErr w:type="gramStart"/>
-      <w:r>
-        <w:rPr>
-          <w:sz w:val="20"/>
-          <w:szCs w:val="20"/>
-        </w:rPr>
-        <w:t>client .</w:t>
-      </w:r>
-      <w:proofErr w:type="gramEnd"/>
-    </w:p>
-    <w:p>
-      <w:pPr>
-        <w:tabs>
-          <w:tab w:val="left" w:pos="1172"/>
-        </w:tabs>
-        <w:spacing w:after="0"/>
-        <w:rPr>
-          <w:sz w:val="20"/>
-          <w:szCs w:val="20"/>
-        </w:rPr>
-      </w:pPr>
-    </w:p>
-    <w:p>
-      <w:pPr>
-        <w:tabs>
-          <w:tab w:val="left" w:pos="1172"/>
-        </w:tabs>
-        <w:spacing w:after="0"/>
-        <w:rPr>
-          <w:sz w:val="20"/>
-          <w:szCs w:val="20"/>
-        </w:rPr>
-      </w:pPr>
-      <w:r>
-        <w:rPr>
-          <w:sz w:val="20"/>
-          <w:szCs w:val="20"/>
-        </w:rPr>
-        <w:t>Hystrix also offers a super cool dashboard. To us it we add the following to pom.xml</w:t>
-      </w:r>
-    </w:p>
-    <w:p>
-      <w:pPr>
-        <w:tabs>
-          <w:tab w:val="left" w:pos="1172"/>
-        </w:tabs>
-        <w:spacing w:after="0"/>
-        <w:rPr>
-          <w:sz w:val="20"/>
-          <w:szCs w:val="20"/>
-        </w:rPr>
-      </w:pPr>
-    </w:p>
-    <w:p>
-      <w:pPr>
-        <w:tabs>
-          <w:tab w:val="left" w:pos="1172"/>
-        </w:tabs>
-        <w:spacing w:after="0"/>
-        <w:rPr>
-          <w:sz w:val="20"/>
-          <w:szCs w:val="20"/>
-        </w:rPr>
-      </w:pPr>
-      <w:r>
-        <w:rPr>
-          <w:sz w:val="20"/>
-          <w:szCs w:val="20"/>
-        </w:rPr>
-        <w:t>&lt;dependency&gt;</w:t>
-      </w:r>
-    </w:p>
-    <w:p>
-      <w:pPr>
-        <w:tabs>
-          <w:tab w:val="left" w:pos="1172"/>
-        </w:tabs>
-        <w:spacing w:after="0"/>
-        <w:rPr>
-          <w:sz w:val="20"/>
-          <w:szCs w:val="20"/>
-        </w:rPr>
-      </w:pPr>
-      <w:proofErr w:type="gramStart"/>
-      <w:r>
-        <w:rPr>
-          <w:sz w:val="20"/>
-          <w:szCs w:val="20"/>
-        </w:rPr>
-        <w:t>&lt;</w:t>
-      </w:r>
-      <w:proofErr w:type="spellStart"/>
-      <w:r>
-        <w:rPr>
-          <w:sz w:val="20"/>
-          <w:szCs w:val="20"/>
-        </w:rPr>
-        <w:t>groupId</w:t>
-      </w:r>
-      <w:proofErr w:type="spellEnd"/>
-      <w:r>
-        <w:rPr>
-          <w:sz w:val="20"/>
-          <w:szCs w:val="20"/>
-        </w:rPr>
-        <w:t>&gt;</w:t>
-      </w:r>
-      <w:proofErr w:type="spellStart"/>
-      <w:r>
-        <w:rPr>
-          <w:sz w:val="20"/>
-          <w:szCs w:val="20"/>
-        </w:rPr>
-        <w:t>org.springframework.cloud</w:t>
-      </w:r>
-      <w:proofErr w:type="spellEnd"/>
-      <w:proofErr w:type="gramEnd"/>
-      <w:r>
-        <w:rPr>
-          <w:sz w:val="20"/>
-          <w:szCs w:val="20"/>
-        </w:rPr>
-        <w:t>&lt;/</w:t>
-      </w:r>
-      <w:proofErr w:type="spellStart"/>
-      <w:r>
-        <w:rPr>
-          <w:sz w:val="20"/>
-          <w:szCs w:val="20"/>
-        </w:rPr>
-        <w:t>groupId</w:t>
-      </w:r>
-      <w:proofErr w:type="spellEnd"/>
-      <w:r>
-        <w:rPr>
-          <w:sz w:val="20"/>
-          <w:szCs w:val="20"/>
-        </w:rPr>
-        <w:t>&gt;</w:t>
-      </w:r>
-    </w:p>
-    <w:p>
-      <w:pPr>
-        <w:tabs>
-          <w:tab w:val="left" w:pos="1172"/>
-        </w:tabs>
-        <w:spacing w:after="0"/>
-        <w:rPr>
-          <w:sz w:val="20"/>
-          <w:szCs w:val="20"/>
-        </w:rPr>
-      </w:pPr>
-      <w:r>
-        <w:rPr>
-          <w:sz w:val="20"/>
-          <w:szCs w:val="20"/>
-        </w:rPr>
-        <w:t>&lt;artifactId&gt;spring-cloud-starter-netflix-hystrix-dashboard&lt;/artifactId&gt;</w:t>
-      </w:r>
-    </w:p>
-    <w:p>
-      <w:pPr>
-        <w:tabs>
-          <w:tab w:val="left" w:pos="1172"/>
-        </w:tabs>
-        <w:spacing w:after="0"/>
-        <w:rPr>
-          <w:sz w:val="20"/>
-          <w:szCs w:val="20"/>
-        </w:rPr>
-      </w:pPr>
-      <w:r>
-        <w:rPr>
-          <w:sz w:val="20"/>
-          <w:szCs w:val="20"/>
-        </w:rPr>
-        <w:t>&lt;/dependency&gt;</w:t>
-      </w:r>
-    </w:p>
-    <w:p>
-      <w:pPr>
-        <w:tabs>
-          <w:tab w:val="left" w:pos="1172"/>
-        </w:tabs>
-        <w:spacing w:after="0"/>
-        <w:rPr>
-          <w:sz w:val="20"/>
-          <w:szCs w:val="20"/>
-        </w:rPr>
-      </w:pPr>
-    </w:p>
-    <w:p>
-      <w:pPr>
-        <w:tabs>
-          <w:tab w:val="left" w:pos="1172"/>
-        </w:tabs>
-        <w:spacing w:after="0"/>
-        <w:rPr>
-          <w:sz w:val="20"/>
-          <w:szCs w:val="20"/>
-        </w:rPr>
-      </w:pPr>
-      <w:r>
-        <w:rPr>
-          <w:sz w:val="20"/>
-          <w:szCs w:val="20"/>
-        </w:rPr>
-        <w:t>Add @EnableHystrixDashboard on the Application class</w:t>
-      </w:r>
-    </w:p>
-    <w:p>
-      <w:pPr>
-        <w:tabs>
-          <w:tab w:val="left" w:pos="1172"/>
-        </w:tabs>
-        <w:spacing w:after="0"/>
-        <w:rPr>
-          <w:sz w:val="20"/>
-          <w:szCs w:val="20"/>
-        </w:rPr>
-      </w:pPr>
-    </w:p>
-    <w:p>
-      <w:pPr>
-        <w:tabs>
-          <w:tab w:val="left" w:pos="1172"/>
-        </w:tabs>
-        <w:spacing w:after="0"/>
-        <w:rPr>
-          <w:sz w:val="20"/>
-          <w:szCs w:val="20"/>
-        </w:rPr>
-      </w:pPr>
-      <w:r>
-        <w:rPr>
-          <w:sz w:val="20"/>
-          <w:szCs w:val="20"/>
-        </w:rPr>
-        <w:t>Hystrix metrics can then be seen on the hystrix dashboard from a browser.</w:t>
-      </w:r>
-    </w:p>
-    <w:p>
-      <w:pPr>
-        <w:tabs>
-          <w:tab w:val="left" w:pos="1172"/>
-        </w:tabs>
-        <w:spacing w:after="0"/>
-        <w:rPr>
-          <w:sz w:val="20"/>
-          <w:szCs w:val="20"/>
-        </w:rPr>
-      </w:pPr>
-    </w:p>
-    <w:p>
-      <w:pPr>
-        <w:tabs>
-          <w:tab w:val="left" w:pos="1172"/>
-        </w:tabs>
-        <w:spacing w:after="0"/>
-        <w:rPr>
-          <w:sz w:val="20"/>
-          <w:szCs w:val="20"/>
-        </w:rPr>
-      </w:pPr>
-      <w:r>
-        <w:rPr>
-          <w:sz w:val="20"/>
-          <w:szCs w:val="20"/>
-        </w:rPr>
-        <w:t xml:space="preserve">5) What </w:t>
-      </w:r>
-      <w:proofErr w:type="gramStart"/>
-      <w:r>
-        <w:rPr>
-          <w:sz w:val="20"/>
-          <w:szCs w:val="20"/>
-        </w:rPr>
-        <w:t>are</w:t>
-      </w:r>
-      <w:proofErr w:type="gramEnd"/>
-      <w:r>
-        <w:rPr>
-          <w:sz w:val="20"/>
-          <w:szCs w:val="20"/>
-        </w:rPr>
-        <w:t xml:space="preserve"> Sleuth and Zipkin</w:t>
-      </w:r>
-    </w:p>
-    <w:p>
-      <w:pPr>
-        <w:tabs>
-          <w:tab w:val="left" w:pos="1172"/>
-        </w:tabs>
-        <w:spacing w:after="0"/>
-        <w:rPr>
-          <w:sz w:val="20"/>
-          <w:szCs w:val="20"/>
-        </w:rPr>
-      </w:pPr>
-      <w:r>
-        <w:rPr>
-          <w:sz w:val="20"/>
-          <w:szCs w:val="20"/>
-        </w:rPr>
-        <w:t xml:space="preserve">It is very important that we should be able to trace the microservices requests as they flow from one service to another and if they fail where exactly they </w:t>
-      </w:r>
-      <w:proofErr w:type="spellStart"/>
-      <w:proofErr w:type="gramStart"/>
-      <w:r>
-        <w:rPr>
-          <w:sz w:val="20"/>
-          <w:szCs w:val="20"/>
-        </w:rPr>
-        <w:t>failed.Sleuth</w:t>
-      </w:r>
-      <w:proofErr w:type="spellEnd"/>
-      <w:proofErr w:type="gramEnd"/>
-      <w:r>
-        <w:rPr>
-          <w:sz w:val="20"/>
-          <w:szCs w:val="20"/>
-        </w:rPr>
-        <w:t xml:space="preserve"> and Zipkin provide these distributor tracing capabilities.</w:t>
-      </w:r>
-    </w:p>
-    <w:p>
-      <w:pPr>
-        <w:tabs>
-          <w:tab w:val="left" w:pos="1172"/>
-        </w:tabs>
-        <w:spacing w:after="0"/>
-        <w:rPr>
-          <w:sz w:val="20"/>
-          <w:szCs w:val="20"/>
-        </w:rPr>
-      </w:pPr>
-    </w:p>
-    <w:p>
-      <w:pPr>
-        <w:tabs>
-          <w:tab w:val="left" w:pos="1172"/>
-        </w:tabs>
-        <w:spacing w:after="0"/>
-        <w:rPr>
-          <w:sz w:val="20"/>
-          <w:szCs w:val="20"/>
-        </w:rPr>
-      </w:pPr>
-      <w:r>
-        <w:rPr>
-          <w:noProof/>
-          <w:sz w:val="20"/>
-          <w:szCs w:val="20"/>
-        </w:rPr>
-        <w:drawing>
-          <wp:inline distT="0" distB="0" distL="0" distR="0" wp14:anchorId="3BAD7A31" wp14:editId="0C997BFF">
-            <wp:extent cx="5036820" cy="2842260"/>
-            <wp:effectExtent l="0" t="0" r="0" b="0"/>
-            <wp:docPr id="276057737" name="Picture 7"/>
-            <wp:cNvGraphicFramePr>
-              <a:graphicFrameLocks xmlns:a="http://schemas.openxmlformats.org/drawingml/2006/main" noChangeAspect="1"/>
-            </wp:cNvGraphicFramePr>
-            <a:graphic xmlns:a="http://schemas.openxmlformats.org/drawingml/2006/main">
-              <a:graphicData uri="http://schemas.openxmlformats.org/drawingml/2006/picture">
-                <pic:pic xmlns:pic="http://schemas.openxmlformats.org/drawingml/2006/picture">
-                  <pic:nvPicPr>
-                    <pic:cNvPr id="0" name="Picture 36"/>
-                    <pic:cNvPicPr>
-                      <a:picLocks noChangeAspect="1" noChangeArrowheads="1"/>
-                    </pic:cNvPicPr>
-                  </pic:nvPicPr>
-                  <pic:blipFill>
-                    <a:blip r:embed="rId27" cstate="print">
-                      <a:extLst>
-                        <a:ext uri="{28A0092B-C50C-407E-A947-70E740481C1C}">
-                          <a14:useLocalDpi xmlns:a14="http://schemas.microsoft.com/office/drawing/2010/main" val="0"/>
-                        </a:ext>
-                      </a:extLst>
-                    </a:blip>
-                    <a:srcRect/>
-                    <a:stretch>
-                      <a:fillRect/>
-                    </a:stretch>
-                  </pic:blipFill>
-                  <pic:spPr bwMode="auto">
-                    <a:xfrm>
-                      <a:off x="0" y="0"/>
-                      <a:ext cx="5036820" cy="2842260"/>
-                    </a:xfrm>
-                    <a:prstGeom prst="rect">
-                      <a:avLst/>
-                    </a:prstGeom>
-                    <a:noFill/>
-                    <a:ln>
-                      <a:noFill/>
-                    </a:ln>
-                  </pic:spPr>
-                </pic:pic>
-              </a:graphicData>
-            </a:graphic>
-          </wp:inline>
-        </w:drawing>
-      </w:r>
-    </w:p>
-    <w:p>
-      <w:pPr>
-        <w:tabs>
-          <w:tab w:val="left" w:pos="1172"/>
-        </w:tabs>
-        <w:spacing w:after="0"/>
-        <w:rPr>
-          <w:sz w:val="20"/>
-          <w:szCs w:val="20"/>
-        </w:rPr>
-      </w:pPr>
-      <w:r>
-        <w:rPr>
-          <w:sz w:val="20"/>
-          <w:szCs w:val="20"/>
-        </w:rPr>
-        <w:t xml:space="preserve">As our requests flow from micro service to another Sleuth is responsible for adding a trace id for these </w:t>
-      </w:r>
-      <w:proofErr w:type="spellStart"/>
-      <w:proofErr w:type="gramStart"/>
-      <w:r>
-        <w:rPr>
-          <w:sz w:val="20"/>
-          <w:szCs w:val="20"/>
-        </w:rPr>
-        <w:t>requests.That</w:t>
-      </w:r>
-      <w:proofErr w:type="spellEnd"/>
-      <w:proofErr w:type="gramEnd"/>
-      <w:r>
-        <w:rPr>
-          <w:sz w:val="20"/>
-          <w:szCs w:val="20"/>
-        </w:rPr>
-        <w:t xml:space="preserve"> trace id will show up in the </w:t>
-      </w:r>
-      <w:proofErr w:type="gramStart"/>
-      <w:r>
-        <w:rPr>
-          <w:sz w:val="20"/>
-          <w:szCs w:val="20"/>
-        </w:rPr>
-        <w:t>logs .That</w:t>
-      </w:r>
-      <w:proofErr w:type="gramEnd"/>
-      <w:r>
-        <w:rPr>
-          <w:sz w:val="20"/>
-          <w:szCs w:val="20"/>
-        </w:rPr>
-        <w:t xml:space="preserve"> way we can track our request across micro services and we can easily figure out where things are going wrong if they do.</w:t>
-      </w:r>
-    </w:p>
-    <w:p>
-      <w:pPr>
-        <w:tabs>
-          <w:tab w:val="left" w:pos="1172"/>
-        </w:tabs>
-        <w:spacing w:after="0"/>
-        <w:rPr>
-          <w:sz w:val="20"/>
-          <w:szCs w:val="20"/>
-        </w:rPr>
-      </w:pPr>
-      <w:r>
-        <w:rPr>
-          <w:sz w:val="20"/>
-          <w:szCs w:val="20"/>
-        </w:rPr>
-        <w:t>Zipkin is responsible for providing a dashboard where all traces by sleuth are exported and it will display them beautifully.</w:t>
-      </w:r>
-    </w:p>
-    <w:p>
-      <w:pPr>
-        <w:tabs>
-          <w:tab w:val="left" w:pos="1172"/>
-        </w:tabs>
-        <w:spacing w:after="0"/>
-        <w:rPr>
-          <w:sz w:val="20"/>
-          <w:szCs w:val="20"/>
-        </w:rPr>
-      </w:pPr>
-    </w:p>
-    <w:p>
-      <w:pPr>
-        <w:tabs>
-          <w:tab w:val="left" w:pos="1172"/>
-        </w:tabs>
-        <w:spacing w:after="0"/>
-        <w:rPr>
-          <w:sz w:val="20"/>
-          <w:szCs w:val="20"/>
-        </w:rPr>
-      </w:pPr>
-      <w:r>
-        <w:rPr>
-          <w:sz w:val="20"/>
-          <w:szCs w:val="20"/>
-        </w:rPr>
-        <w:t>To use Sleuth just add the following to pom</w:t>
-      </w:r>
-    </w:p>
-    <w:p>
-      <w:pPr>
-        <w:tabs>
-          <w:tab w:val="left" w:pos="1172"/>
-        </w:tabs>
-        <w:spacing w:after="0"/>
-        <w:rPr>
-          <w:sz w:val="20"/>
-          <w:szCs w:val="20"/>
-        </w:rPr>
-      </w:pPr>
-      <w:r>
-        <w:rPr>
-          <w:sz w:val="20"/>
-          <w:szCs w:val="20"/>
-        </w:rPr>
-        <w:t>&lt;dependency&gt;</w:t>
-      </w:r>
-    </w:p>
-    <w:p>
-      <w:pPr>
-        <w:tabs>
-          <w:tab w:val="left" w:pos="1172"/>
-        </w:tabs>
-        <w:spacing w:after="0"/>
-        <w:rPr>
-          <w:sz w:val="20"/>
-          <w:szCs w:val="20"/>
-        </w:rPr>
-      </w:pPr>
-      <w:proofErr w:type="gramStart"/>
-      <w:r>
-        <w:rPr>
-          <w:sz w:val="20"/>
-          <w:szCs w:val="20"/>
-        </w:rPr>
-        <w:t>&lt;</w:t>
-      </w:r>
-      <w:proofErr w:type="spellStart"/>
-      <w:r>
-        <w:rPr>
-          <w:sz w:val="20"/>
-          <w:szCs w:val="20"/>
-        </w:rPr>
-        <w:t>groupId</w:t>
-      </w:r>
-      <w:proofErr w:type="spellEnd"/>
-      <w:r>
-        <w:rPr>
-          <w:sz w:val="20"/>
-          <w:szCs w:val="20"/>
-        </w:rPr>
-        <w:t>&gt;</w:t>
-      </w:r>
-      <w:proofErr w:type="spellStart"/>
-      <w:r>
-        <w:rPr>
-          <w:sz w:val="20"/>
-          <w:szCs w:val="20"/>
-        </w:rPr>
-        <w:t>org.springframework.cloud</w:t>
-      </w:r>
-      <w:proofErr w:type="spellEnd"/>
-      <w:proofErr w:type="gramEnd"/>
-      <w:r>
-        <w:rPr>
-          <w:sz w:val="20"/>
-          <w:szCs w:val="20"/>
-        </w:rPr>
-        <w:t>&lt;/</w:t>
-      </w:r>
-      <w:proofErr w:type="spellStart"/>
-      <w:r>
-        <w:rPr>
-          <w:sz w:val="20"/>
-          <w:szCs w:val="20"/>
-        </w:rPr>
-        <w:t>groupId</w:t>
-      </w:r>
-      <w:proofErr w:type="spellEnd"/>
-      <w:r>
-        <w:rPr>
-          <w:sz w:val="20"/>
-          <w:szCs w:val="20"/>
-        </w:rPr>
-        <w:t>&gt;</w:t>
-      </w:r>
-    </w:p>
-    <w:p>
-      <w:pPr>
-        <w:tabs>
-          <w:tab w:val="left" w:pos="1172"/>
-        </w:tabs>
-        <w:spacing w:after="0"/>
-        <w:rPr>
-          <w:sz w:val="20"/>
-          <w:szCs w:val="20"/>
-        </w:rPr>
-      </w:pPr>
-      <w:r>
-        <w:rPr>
-          <w:sz w:val="20"/>
-          <w:szCs w:val="20"/>
-        </w:rPr>
-        <w:t>&lt;</w:t>
-      </w:r>
-      <w:proofErr w:type="spellStart"/>
-      <w:r>
-        <w:rPr>
-          <w:sz w:val="20"/>
-          <w:szCs w:val="20"/>
-        </w:rPr>
-        <w:t>artifactId</w:t>
-      </w:r>
-      <w:proofErr w:type="spellEnd"/>
-      <w:r>
-        <w:rPr>
-          <w:sz w:val="20"/>
-          <w:szCs w:val="20"/>
-        </w:rPr>
-        <w:t>&gt;spring-cloud-starter-sleuth&lt;/</w:t>
-      </w:r>
-      <w:proofErr w:type="spellStart"/>
-      <w:r>
-        <w:rPr>
-          <w:sz w:val="20"/>
-          <w:szCs w:val="20"/>
-        </w:rPr>
-        <w:t>artifactId</w:t>
-      </w:r>
-      <w:proofErr w:type="spellEnd"/>
-      <w:r>
-        <w:rPr>
-          <w:sz w:val="20"/>
-          <w:szCs w:val="20"/>
-        </w:rPr>
-        <w:t>&gt;</w:t>
-      </w:r>
-    </w:p>
-    <w:p>
-      <w:pPr>
-        <w:tabs>
-          <w:tab w:val="left" w:pos="1172"/>
-        </w:tabs>
-        <w:spacing w:after="0"/>
-        <w:rPr>
-          <w:sz w:val="20"/>
-          <w:szCs w:val="20"/>
-        </w:rPr>
-      </w:pPr>
-      <w:r>
-        <w:rPr>
-          <w:sz w:val="20"/>
-          <w:szCs w:val="20"/>
-        </w:rPr>
-        <w:t>&lt;/dependency&gt;</w:t>
-      </w:r>
-    </w:p>
-    <w:p>
-      <w:pPr>
-        <w:tabs>
-          <w:tab w:val="left" w:pos="1172"/>
-        </w:tabs>
-        <w:spacing w:after="0"/>
-        <w:rPr>
-          <w:sz w:val="20"/>
-          <w:szCs w:val="20"/>
-        </w:rPr>
-      </w:pPr>
-    </w:p>
-    <w:p>
-      <w:pPr>
-        <w:tabs>
-          <w:tab w:val="left" w:pos="1172"/>
-        </w:tabs>
-        <w:spacing w:after="0"/>
-        <w:rPr>
-          <w:sz w:val="20"/>
-          <w:szCs w:val="20"/>
-        </w:rPr>
-      </w:pPr>
-      <w:r>
-        <w:rPr>
-          <w:sz w:val="20"/>
-          <w:szCs w:val="20"/>
-        </w:rPr>
-        <w:t>And for Zipkin add</w:t>
-      </w:r>
-    </w:p>
-    <w:p>
-      <w:pPr>
-        <w:tabs>
-          <w:tab w:val="left" w:pos="1172"/>
-        </w:tabs>
-        <w:spacing w:after="0"/>
-        <w:rPr>
-          <w:sz w:val="20"/>
-          <w:szCs w:val="20"/>
-        </w:rPr>
-      </w:pPr>
-      <w:r>
-        <w:rPr>
-          <w:sz w:val="20"/>
-          <w:szCs w:val="20"/>
-        </w:rPr>
-        <w:t>&lt;dependency&gt;</w:t>
-      </w:r>
-    </w:p>
-    <w:p>
-      <w:pPr>
-        <w:tabs>
-          <w:tab w:val="left" w:pos="1172"/>
-        </w:tabs>
-        <w:spacing w:after="0"/>
-        <w:rPr>
-          <w:sz w:val="20"/>
-          <w:szCs w:val="20"/>
-        </w:rPr>
-      </w:pPr>
-      <w:proofErr w:type="gramStart"/>
-      <w:r>
-        <w:rPr>
-          <w:sz w:val="20"/>
-          <w:szCs w:val="20"/>
-        </w:rPr>
-        <w:t>&lt;</w:t>
-      </w:r>
-      <w:proofErr w:type="spellStart"/>
-      <w:r>
-        <w:rPr>
-          <w:sz w:val="20"/>
-          <w:szCs w:val="20"/>
-        </w:rPr>
-        <w:t>groupId</w:t>
-      </w:r>
-      <w:proofErr w:type="spellEnd"/>
-      <w:r>
-        <w:rPr>
-          <w:sz w:val="20"/>
-          <w:szCs w:val="20"/>
-        </w:rPr>
-        <w:t>&gt;</w:t>
-      </w:r>
-      <w:proofErr w:type="spellStart"/>
-      <w:r>
-        <w:rPr>
-          <w:sz w:val="20"/>
-          <w:szCs w:val="20"/>
-        </w:rPr>
-        <w:t>org.springframework.cloud</w:t>
-      </w:r>
-      <w:proofErr w:type="spellEnd"/>
-      <w:proofErr w:type="gramEnd"/>
-      <w:r>
-        <w:rPr>
-          <w:sz w:val="20"/>
-          <w:szCs w:val="20"/>
-        </w:rPr>
-        <w:t>&lt;/</w:t>
-      </w:r>
-      <w:proofErr w:type="spellStart"/>
-      <w:r>
-        <w:rPr>
-          <w:sz w:val="20"/>
-          <w:szCs w:val="20"/>
-        </w:rPr>
-        <w:t>groupId</w:t>
-      </w:r>
-      <w:proofErr w:type="spellEnd"/>
-      <w:r>
-        <w:rPr>
-          <w:sz w:val="20"/>
-          <w:szCs w:val="20"/>
-        </w:rPr>
-        <w:t>&gt;</w:t>
-      </w:r>
-    </w:p>
-    <w:p>
-      <w:pPr>
-        <w:tabs>
-          <w:tab w:val="left" w:pos="1172"/>
-        </w:tabs>
-        <w:spacing w:after="0"/>
-        <w:rPr>
-          <w:sz w:val="20"/>
-          <w:szCs w:val="20"/>
-        </w:rPr>
-      </w:pPr>
-      <w:r>
-        <w:rPr>
-          <w:sz w:val="20"/>
-          <w:szCs w:val="20"/>
-        </w:rPr>
-        <w:t>&lt;</w:t>
-      </w:r>
-      <w:proofErr w:type="spellStart"/>
-      <w:r>
-        <w:rPr>
-          <w:sz w:val="20"/>
-          <w:szCs w:val="20"/>
-        </w:rPr>
-        <w:t>artifactId</w:t>
-      </w:r>
-      <w:proofErr w:type="spellEnd"/>
-      <w:r>
-        <w:rPr>
-          <w:sz w:val="20"/>
-          <w:szCs w:val="20"/>
-        </w:rPr>
-        <w:t>&gt;spring-cloud-starter-</w:t>
-      </w:r>
-      <w:proofErr w:type="spellStart"/>
-      <w:r>
-        <w:rPr>
-          <w:sz w:val="20"/>
-          <w:szCs w:val="20"/>
-        </w:rPr>
-        <w:t>zipkin</w:t>
-      </w:r>
-      <w:proofErr w:type="spellEnd"/>
-      <w:r>
-        <w:rPr>
-          <w:sz w:val="20"/>
-          <w:szCs w:val="20"/>
-        </w:rPr>
-        <w:t>&lt;/</w:t>
-      </w:r>
-      <w:proofErr w:type="spellStart"/>
-      <w:r>
-        <w:rPr>
-          <w:sz w:val="20"/>
-          <w:szCs w:val="20"/>
-        </w:rPr>
-        <w:t>artifactId</w:t>
-      </w:r>
-      <w:proofErr w:type="spellEnd"/>
-      <w:r>
-        <w:rPr>
-          <w:sz w:val="20"/>
-          <w:szCs w:val="20"/>
-        </w:rPr>
-        <w:t>&gt;</w:t>
-      </w:r>
-    </w:p>
-    <w:p>
-      <w:pPr>
-        <w:tabs>
-          <w:tab w:val="left" w:pos="1172"/>
-        </w:tabs>
-        <w:spacing w:after="0"/>
-        <w:rPr>
-          <w:sz w:val="20"/>
-          <w:szCs w:val="20"/>
-        </w:rPr>
-      </w:pPr>
-      <w:r>
-        <w:rPr>
-          <w:sz w:val="20"/>
-          <w:szCs w:val="20"/>
-        </w:rPr>
-        <w:t>&lt;/dependency&gt;</w:t>
-      </w:r>
-    </w:p>
-    <w:p>
-      <w:pPr>
-        <w:tabs>
-          <w:tab w:val="left" w:pos="1172"/>
-        </w:tabs>
-        <w:spacing w:after="0"/>
-        <w:rPr>
-          <w:sz w:val="20"/>
-          <w:szCs w:val="20"/>
-        </w:rPr>
-      </w:pPr>
-      <w:r>
-        <w:rPr>
-          <w:sz w:val="20"/>
-          <w:szCs w:val="20"/>
-        </w:rPr>
-        <w:t>Download and run Zipkin server</w:t>
-      </w:r>
-    </w:p>
-    <w:p>
-      <w:pPr>
-        <w:tabs>
-          <w:tab w:val="left" w:pos="1172"/>
-        </w:tabs>
-        <w:spacing w:after="0"/>
-        <w:rPr>
-          <w:sz w:val="20"/>
-          <w:szCs w:val="20"/>
-        </w:rPr>
-      </w:pPr>
-      <w:r>
-        <w:rPr>
-          <w:sz w:val="20"/>
-          <w:szCs w:val="20"/>
-        </w:rPr>
-        <w:t>curl -</w:t>
-      </w:r>
-      <w:proofErr w:type="spellStart"/>
-      <w:r>
-        <w:rPr>
-          <w:sz w:val="20"/>
-          <w:szCs w:val="20"/>
-        </w:rPr>
-        <w:t>sSL</w:t>
-      </w:r>
-      <w:proofErr w:type="spellEnd"/>
-      <w:r>
-        <w:rPr>
-          <w:sz w:val="20"/>
-          <w:szCs w:val="20"/>
-        </w:rPr>
-        <w:t xml:space="preserve"> https://zipkin.io/quickstart.sh | bash -s</w:t>
-      </w:r>
-    </w:p>
-    <w:p>
-      <w:pPr>
-        <w:tabs>
-          <w:tab w:val="left" w:pos="1172"/>
-        </w:tabs>
-        <w:spacing w:after="0"/>
-        <w:rPr>
-          <w:sz w:val="20"/>
-          <w:szCs w:val="20"/>
-        </w:rPr>
-      </w:pPr>
-    </w:p>
-    <w:p>
-      <w:pPr>
-        <w:tabs>
-          <w:tab w:val="left" w:pos="1172"/>
-        </w:tabs>
-        <w:spacing w:after="0"/>
-        <w:rPr>
-          <w:sz w:val="20"/>
-          <w:szCs w:val="20"/>
-        </w:rPr>
-      </w:pPr>
-      <w:r>
-        <w:rPr>
-          <w:sz w:val="20"/>
-          <w:szCs w:val="20"/>
-        </w:rPr>
-        <w:t>java -jar zipkin.jar</w:t>
-      </w:r>
-    </w:p>
-    <w:p>
-      <w:pPr>
-        <w:tabs>
-          <w:tab w:val="left" w:pos="1172"/>
-        </w:tabs>
-        <w:spacing w:after="0"/>
-        <w:rPr>
-          <w:sz w:val="20"/>
-          <w:szCs w:val="20"/>
-        </w:rPr>
-      </w:pPr>
-    </w:p>
-    <w:p>
-      <w:pPr>
-        <w:tabs>
-          <w:tab w:val="left" w:pos="1172"/>
-        </w:tabs>
-        <w:spacing w:after="0"/>
-        <w:rPr>
-          <w:sz w:val="20"/>
-          <w:szCs w:val="20"/>
-        </w:rPr>
-      </w:pPr>
-      <w:r>
-        <w:rPr>
-          <w:sz w:val="20"/>
-          <w:szCs w:val="20"/>
-        </w:rPr>
-        <w:t>6) How to use Centralized Configuration</w:t>
-      </w:r>
-    </w:p>
-    <w:p>
-      <w:pPr>
-        <w:tabs>
-          <w:tab w:val="left" w:pos="1172"/>
-        </w:tabs>
-        <w:spacing w:after="0"/>
-        <w:rPr>
-          <w:sz w:val="20"/>
-          <w:szCs w:val="20"/>
-        </w:rPr>
-      </w:pPr>
-      <w:r>
-        <w:rPr>
-          <w:sz w:val="20"/>
-          <w:szCs w:val="20"/>
-        </w:rPr>
-        <w:t xml:space="preserve">Every Microservice application will have associated </w:t>
-      </w:r>
-      <w:proofErr w:type="spellStart"/>
-      <w:proofErr w:type="gramStart"/>
-      <w:r>
-        <w:rPr>
-          <w:sz w:val="20"/>
-          <w:szCs w:val="20"/>
-        </w:rPr>
-        <w:t>configuration.This</w:t>
-      </w:r>
-      <w:proofErr w:type="spellEnd"/>
-      <w:proofErr w:type="gramEnd"/>
-      <w:r>
-        <w:rPr>
-          <w:sz w:val="20"/>
-          <w:szCs w:val="20"/>
-        </w:rPr>
-        <w:t xml:space="preserve"> could be the database connection </w:t>
-      </w:r>
-      <w:proofErr w:type="gramStart"/>
-      <w:r>
-        <w:rPr>
-          <w:sz w:val="20"/>
-          <w:szCs w:val="20"/>
-        </w:rPr>
-        <w:t>information ,</w:t>
-      </w:r>
-      <w:proofErr w:type="gramEnd"/>
-      <w:r>
-        <w:rPr>
-          <w:sz w:val="20"/>
-          <w:szCs w:val="20"/>
-        </w:rPr>
-        <w:t xml:space="preserve"> the message broker information if it is a messaging application and application specific configuration as </w:t>
-      </w:r>
-      <w:proofErr w:type="spellStart"/>
-      <w:proofErr w:type="gramStart"/>
-      <w:r>
-        <w:rPr>
-          <w:sz w:val="20"/>
-          <w:szCs w:val="20"/>
-        </w:rPr>
-        <w:t>well.And</w:t>
-      </w:r>
-      <w:proofErr w:type="spellEnd"/>
-      <w:proofErr w:type="gramEnd"/>
-      <w:r>
-        <w:rPr>
-          <w:sz w:val="20"/>
-          <w:szCs w:val="20"/>
-        </w:rPr>
-        <w:t xml:space="preserve"> this information will be different for different environments.</w:t>
-      </w:r>
-    </w:p>
-    <w:p>
-      <w:pPr>
-        <w:tabs>
-          <w:tab w:val="left" w:pos="1172"/>
-        </w:tabs>
-        <w:spacing w:after="0"/>
-        <w:rPr>
-          <w:sz w:val="20"/>
-          <w:szCs w:val="20"/>
-        </w:rPr>
-      </w:pPr>
-      <w:r>
-        <w:rPr>
-          <w:sz w:val="20"/>
-          <w:szCs w:val="20"/>
-        </w:rPr>
-        <w:t xml:space="preserve">On a local developer's </w:t>
-      </w:r>
-      <w:proofErr w:type="gramStart"/>
-      <w:r>
-        <w:rPr>
-          <w:sz w:val="20"/>
-          <w:szCs w:val="20"/>
-        </w:rPr>
-        <w:t>machine</w:t>
-      </w:r>
-      <w:proofErr w:type="gramEnd"/>
-      <w:r>
-        <w:rPr>
-          <w:sz w:val="20"/>
-          <w:szCs w:val="20"/>
-        </w:rPr>
-        <w:t xml:space="preserve"> a database that he wants to connect is different from the one dev environment shared by all the developers and the testing team will have their own database servers their own message brokers and also application specific </w:t>
-      </w:r>
-      <w:proofErr w:type="spellStart"/>
-      <w:proofErr w:type="gramStart"/>
-      <w:r>
-        <w:rPr>
-          <w:sz w:val="20"/>
-          <w:szCs w:val="20"/>
-        </w:rPr>
-        <w:t>configuration.Same</w:t>
-      </w:r>
-      <w:proofErr w:type="spellEnd"/>
-      <w:proofErr w:type="gramEnd"/>
-      <w:r>
-        <w:rPr>
-          <w:sz w:val="20"/>
-          <w:szCs w:val="20"/>
-        </w:rPr>
-        <w:t xml:space="preserve"> with staging before our application is pushed to production finally the production will have its own set of databases, message brokers etc. Each application can have multiple configurations as well, not just </w:t>
-      </w:r>
-      <w:proofErr w:type="spellStart"/>
-      <w:proofErr w:type="gramStart"/>
-      <w:r>
-        <w:rPr>
-          <w:sz w:val="20"/>
-          <w:szCs w:val="20"/>
-        </w:rPr>
-        <w:t>one.So</w:t>
-      </w:r>
-      <w:proofErr w:type="spellEnd"/>
-      <w:proofErr w:type="gramEnd"/>
-      <w:r>
-        <w:rPr>
-          <w:sz w:val="20"/>
-          <w:szCs w:val="20"/>
-        </w:rPr>
-        <w:t xml:space="preserve"> it is our responsibility to make sure the right configuration information is being pushed across these environments.</w:t>
-      </w:r>
-    </w:p>
-    <w:p>
-      <w:pPr>
-        <w:tabs>
-          <w:tab w:val="left" w:pos="1172"/>
-        </w:tabs>
-        <w:spacing w:after="0"/>
-        <w:rPr>
-          <w:sz w:val="20"/>
-          <w:szCs w:val="20"/>
-        </w:rPr>
-      </w:pPr>
-      <w:r>
-        <w:rPr>
-          <w:sz w:val="20"/>
-          <w:szCs w:val="20"/>
-        </w:rPr>
-        <w:t xml:space="preserve">That is where centralized configuration comes in to make our job as a developer easy. Spring cloud provides a Configuration Server. All the micro service applications will ask this configuration server for the configuration information for a particular environment. On dev environments the configuration server is responsible for giving them the development specific </w:t>
-      </w:r>
-      <w:proofErr w:type="gramStart"/>
-      <w:r>
-        <w:rPr>
-          <w:sz w:val="20"/>
-          <w:szCs w:val="20"/>
-        </w:rPr>
-        <w:t>configuration ,</w:t>
-      </w:r>
-      <w:proofErr w:type="gramEnd"/>
-      <w:r>
-        <w:rPr>
-          <w:sz w:val="20"/>
-          <w:szCs w:val="20"/>
-        </w:rPr>
-        <w:t xml:space="preserve"> which will have the dev specific </w:t>
-      </w:r>
-      <w:proofErr w:type="gramStart"/>
-      <w:r>
-        <w:rPr>
-          <w:sz w:val="20"/>
-          <w:szCs w:val="20"/>
-        </w:rPr>
-        <w:t>databases ,</w:t>
-      </w:r>
-      <w:proofErr w:type="gramEnd"/>
-      <w:r>
-        <w:rPr>
-          <w:sz w:val="20"/>
-          <w:szCs w:val="20"/>
-        </w:rPr>
-        <w:t xml:space="preserve"> dev specific JMS brokers etc. And if they're deployed to staging or production the appropriate configuration should be given by this configuration server.</w:t>
-      </w:r>
-    </w:p>
-    <w:p>
-      <w:pPr>
-        <w:tabs>
-          <w:tab w:val="left" w:pos="1172"/>
-        </w:tabs>
-        <w:spacing w:after="0"/>
-        <w:rPr>
-          <w:sz w:val="20"/>
-          <w:szCs w:val="20"/>
-        </w:rPr>
-      </w:pPr>
-      <w:r>
-        <w:rPr>
-          <w:sz w:val="20"/>
-          <w:szCs w:val="20"/>
-        </w:rPr>
-        <w:t>How will the configuration server know the correct configuration for an environment?</w:t>
-      </w:r>
-    </w:p>
-    <w:p>
-      <w:pPr>
-        <w:tabs>
-          <w:tab w:val="left" w:pos="1172"/>
-        </w:tabs>
-        <w:spacing w:after="0"/>
-        <w:rPr>
-          <w:sz w:val="20"/>
-          <w:szCs w:val="20"/>
-        </w:rPr>
-      </w:pPr>
-      <w:r>
-        <w:rPr>
-          <w:sz w:val="20"/>
-          <w:szCs w:val="20"/>
-        </w:rPr>
-        <w:t xml:space="preserve">We will push all the configuration to the GIT repository. The configuration server knows how to connect to the GIT or SVN repository and it will pull the configuration information and share it across the </w:t>
-      </w:r>
-      <w:proofErr w:type="spellStart"/>
-      <w:proofErr w:type="gramStart"/>
-      <w:r>
-        <w:rPr>
-          <w:sz w:val="20"/>
-          <w:szCs w:val="20"/>
-        </w:rPr>
-        <w:t>microservices.We'll</w:t>
-      </w:r>
-      <w:proofErr w:type="spellEnd"/>
-      <w:proofErr w:type="gramEnd"/>
-      <w:r>
-        <w:rPr>
-          <w:sz w:val="20"/>
-          <w:szCs w:val="20"/>
-        </w:rPr>
-        <w:t xml:space="preserve"> be simply creating the configuration as developers. We can do it on the local machine and it is our responsibility to put that configuration into this GIT repository.</w:t>
-      </w:r>
-    </w:p>
-    <w:p>
-      <w:pPr>
-        <w:tabs>
-          <w:tab w:val="left" w:pos="1172"/>
-        </w:tabs>
-        <w:spacing w:after="0"/>
-        <w:rPr>
-          <w:sz w:val="20"/>
-          <w:szCs w:val="20"/>
-        </w:rPr>
-      </w:pPr>
-      <w:r>
-        <w:rPr>
-          <w:sz w:val="20"/>
-          <w:szCs w:val="20"/>
-        </w:rPr>
-        <w:t xml:space="preserve">All the microservices will have the configuration </w:t>
-      </w:r>
-      <w:proofErr w:type="gramStart"/>
-      <w:r>
-        <w:rPr>
-          <w:sz w:val="20"/>
-          <w:szCs w:val="20"/>
-        </w:rPr>
-        <w:t>available .</w:t>
-      </w:r>
-      <w:proofErr w:type="gramEnd"/>
-      <w:r>
-        <w:rPr>
-          <w:sz w:val="20"/>
-          <w:szCs w:val="20"/>
-        </w:rPr>
-        <w:t xml:space="preserve"> The configuration server is responsible for maintaining and handing over the correct configuration for a correct micros service.</w:t>
-      </w:r>
-    </w:p>
-    <w:p>
-      <w:pPr>
-        <w:tabs>
-          <w:tab w:val="left" w:pos="1172"/>
-        </w:tabs>
-        <w:spacing w:after="0"/>
-        <w:rPr>
-          <w:sz w:val="20"/>
-          <w:szCs w:val="20"/>
-        </w:rPr>
-      </w:pPr>
-    </w:p>
-    <w:p>
-      <w:pPr>
-        <w:tabs>
-          <w:tab w:val="left" w:pos="1172"/>
-        </w:tabs>
-        <w:spacing w:after="0"/>
-        <w:rPr>
-          <w:sz w:val="20"/>
-          <w:szCs w:val="20"/>
-        </w:rPr>
-      </w:pPr>
-      <w:r>
-        <w:rPr>
-          <w:sz w:val="20"/>
-          <w:szCs w:val="20"/>
-        </w:rPr>
-        <w:t>7) What is Spring Cloud Bus</w:t>
-      </w:r>
-    </w:p>
-    <w:p>
-      <w:pPr>
-        <w:tabs>
-          <w:tab w:val="left" w:pos="1172"/>
-        </w:tabs>
-        <w:spacing w:after="0"/>
-        <w:rPr>
-          <w:sz w:val="20"/>
-          <w:szCs w:val="20"/>
-        </w:rPr>
-      </w:pPr>
-      <w:r>
-        <w:rPr>
-          <w:sz w:val="20"/>
-          <w:szCs w:val="20"/>
-        </w:rPr>
-        <w:t xml:space="preserve">When configurations are updated on the fly those changes will not be loaded by the microservice applications running until we restart the application or use a spring boot actuator refresh </w:t>
-      </w:r>
-      <w:proofErr w:type="spellStart"/>
-      <w:r>
-        <w:rPr>
-          <w:sz w:val="20"/>
-          <w:szCs w:val="20"/>
-        </w:rPr>
-        <w:t>url</w:t>
-      </w:r>
-      <w:proofErr w:type="spellEnd"/>
-      <w:r>
-        <w:rPr>
-          <w:sz w:val="20"/>
-          <w:szCs w:val="20"/>
-        </w:rPr>
-        <w:t xml:space="preserve"> for each micro </w:t>
-      </w:r>
-      <w:proofErr w:type="spellStart"/>
-      <w:proofErr w:type="gramStart"/>
-      <w:r>
-        <w:rPr>
-          <w:sz w:val="20"/>
-          <w:szCs w:val="20"/>
-        </w:rPr>
-        <w:t>service.Once</w:t>
-      </w:r>
-      <w:proofErr w:type="spellEnd"/>
-      <w:proofErr w:type="gramEnd"/>
-      <w:r>
-        <w:rPr>
-          <w:sz w:val="20"/>
-          <w:szCs w:val="20"/>
-        </w:rPr>
-        <w:t xml:space="preserve"> you enable the spring cloud </w:t>
-      </w:r>
-      <w:proofErr w:type="gramStart"/>
-      <w:r>
-        <w:rPr>
-          <w:sz w:val="20"/>
-          <w:szCs w:val="20"/>
-        </w:rPr>
-        <w:t>bus ,</w:t>
-      </w:r>
-      <w:proofErr w:type="gramEnd"/>
-      <w:r>
-        <w:rPr>
-          <w:sz w:val="20"/>
-          <w:szCs w:val="20"/>
-        </w:rPr>
-        <w:t xml:space="preserve"> with a single refresh at the cloud bus level all the micro services will get the latest configuration values that are </w:t>
-      </w:r>
-      <w:proofErr w:type="spellStart"/>
-      <w:proofErr w:type="gramStart"/>
-      <w:r>
-        <w:rPr>
-          <w:sz w:val="20"/>
-          <w:szCs w:val="20"/>
-        </w:rPr>
-        <w:t>updated.Spring</w:t>
-      </w:r>
-      <w:proofErr w:type="spellEnd"/>
-      <w:proofErr w:type="gramEnd"/>
-      <w:r>
-        <w:rPr>
-          <w:sz w:val="20"/>
-          <w:szCs w:val="20"/>
-        </w:rPr>
-        <w:t xml:space="preserve"> cloud bus uses messaging brokers to communicate these changes to the applications.</w:t>
-      </w:r>
     </w:p>
     <w:p>
       <w:pPr>

</xml_diff>